<commit_message>
feat(sds): overhaul section 3 with tabular docx layout, polish chemical mapping and CLP compliance (ADR-042)
</commit_message>
<xml_diff>
--- a/docs/SDS/Karta_Charakterystyki_8051944811087_SDS_NAJMA.docx
+++ b/docs/SDS/Karta_Charakterystyki_8051944811087_SDS_NAJMA.docx
@@ -464,578 +464,752 @@
     </w:p>
     <w:p>
       <w:pPr>
-        <w:spacing w:after="80"/>
-      </w:pPr>
-      <w:r>
-        <w:rPr>
-          <w:rFonts w:ascii="Arial" w:cs="Arial" w:eastAsia="Arial" w:hAnsi="Arial"/>
-          <w:sz w:val="20"/>
-          <w:szCs w:val="20"/>
-        </w:rPr>
-        <w:t xml:space="preserve">[ORYGINALNE STĘŻENIA I KLASYFIKACJE ZACHOWANE ZGODNIE Z REGULĄ EXTRACT_RAW]</w:t>
-      </w:r>
-    </w:p>
-    <w:p>
-      <w:pPr>
-        <w:spacing w:after="80"/>
-      </w:pPr>
-      <w:r>
-        <w:rPr>
-          <w:rFonts w:ascii="Arial" w:cs="Arial" w:eastAsia="Arial" w:hAnsi="Arial"/>
-          <w:sz w:val="20"/>
-          <w:szCs w:val="20"/>
-        </w:rPr>
-        <w:t xml:space="preserve">[POLSKIE NAZWY SUBSTANCJI ZMAPOWANE PO CAS]</w:t>
-      </w:r>
-    </w:p>
-    <w:p>
-      <w:pPr>
-        <w:spacing w:after="80"/>
-      </w:pPr>
-      <w:r>
-        <w:rPr>
-          <w:rFonts w:ascii="Arial" w:cs="Arial" w:eastAsia="Arial" w:hAnsi="Arial"/>
-          <w:sz w:val="20"/>
-          <w:szCs w:val="20"/>
-        </w:rPr>
-        <w:t xml:space="preserve">SECTION 3: Composition/information on ingredients</w:t>
-      </w:r>
-    </w:p>
-    <w:p>
-      <w:pPr>
-        <w:spacing w:after="100" w:before="200"/>
-      </w:pPr>
-      <w:r>
-        <w:rPr>
-          <w:rFonts w:ascii="Arial" w:cs="Arial" w:eastAsia="Arial" w:hAnsi="Arial"/>
-          <w:b/>
-          <w:bCs/>
-          <w:sz w:val="20"/>
-          <w:szCs w:val="20"/>
-        </w:rPr>
-        <w:t xml:space="preserve">3.1. Substances</w:t>
-      </w:r>
-    </w:p>
-    <w:p>
-      <w:pPr>
-        <w:spacing w:after="80"/>
-      </w:pPr>
-      <w:r>
-        <w:rPr>
-          <w:rFonts w:ascii="Arial" w:cs="Arial" w:eastAsia="Arial" w:hAnsi="Arial"/>
-          <w:sz w:val="20"/>
-          <w:szCs w:val="20"/>
-        </w:rPr>
-        <w:t xml:space="preserve">N.A.</w:t>
-      </w:r>
-    </w:p>
-    <w:p>
-      <w:pPr>
-        <w:spacing w:after="100" w:before="200"/>
-      </w:pPr>
-      <w:r>
-        <w:rPr>
-          <w:rFonts w:ascii="Arial" w:cs="Arial" w:eastAsia="Arial" w:hAnsi="Arial"/>
-          <w:b/>
-          <w:bCs/>
-          <w:sz w:val="20"/>
-          <w:szCs w:val="20"/>
-        </w:rPr>
-        <w:t xml:space="preserve">3.2. Mixtures</w:t>
-      </w:r>
-    </w:p>
-    <w:p>
-      <w:pPr>
-        <w:spacing w:after="80"/>
-      </w:pPr>
-      <w:r>
-        <w:rPr>
-          <w:rFonts w:ascii="Arial" w:cs="Arial" w:eastAsia="Arial" w:hAnsi="Arial"/>
-          <w:sz w:val="20"/>
-          <w:szCs w:val="20"/>
-        </w:rPr>
-        <w:t xml:space="preserve">Mixture identification:SWEET HOME LAYALI - PROFUMA TESSUTI E AMBIENTE NAJMA</w:t>
-      </w:r>
-    </w:p>
-    <w:p>
-      <w:pPr>
-        <w:spacing w:after="80"/>
-      </w:pPr>
-      <w:r>
-        <w:rPr>
-          <w:rFonts w:ascii="Arial" w:cs="Arial" w:eastAsia="Arial" w:hAnsi="Arial"/>
-          <w:sz w:val="20"/>
-          <w:szCs w:val="20"/>
-        </w:rPr>
-        <w:t xml:space="preserve">Hazardous components within the meaning of the CLP regulation and related classification:</w:t>
-      </w:r>
-    </w:p>
-    <w:p>
-      <w:pPr>
-        <w:spacing w:after="80"/>
-      </w:pPr>
-      <w:r>
-        <w:rPr>
-          <w:rFonts w:ascii="Arial" w:cs="Arial" w:eastAsia="Arial" w:hAnsi="Arial"/>
-          <w:sz w:val="20"/>
-          <w:szCs w:val="20"/>
-        </w:rPr>
-        <w:t xml:space="preserve">QtyNameIdent. Numb.ClassificationRegistration Number</w:t>
-      </w:r>
-    </w:p>
-    <w:p>
-      <w:pPr>
-        <w:spacing w:after="80"/>
-      </w:pPr>
-      <w:r>
-        <w:rPr>
-          <w:rFonts w:ascii="Arial" w:cs="Arial" w:eastAsia="Arial" w:hAnsi="Arial"/>
-          <w:sz w:val="20"/>
-          <w:szCs w:val="20"/>
-        </w:rPr>
-        <w:t xml:space="preserve">Page n.of19</w:t>
-      </w:r>
-    </w:p>
-    <w:p>
-      <w:pPr>
-        <w:spacing w:after="80"/>
-      </w:pPr>
-      <w:r>
-        <w:rPr>
-          <w:rFonts w:ascii="Arial" w:cs="Arial" w:eastAsia="Arial" w:hAnsi="Arial"/>
-          <w:sz w:val="20"/>
-          <w:szCs w:val="20"/>
-        </w:rPr>
-        <w:t xml:space="preserve">07/03/2026Production NameSWEET HOME LAYALI - PROFUMA TESSUTI E AMBIENTE NAJMADate</w:t>
-      </w:r>
-    </w:p>
-    <w:p>
-      <w:pPr>
-        <w:spacing w:after="80"/>
-      </w:pPr>
-      <w:r>
-        <w:rPr>
-          <w:rFonts w:ascii="Arial" w:cs="Arial" w:eastAsia="Arial" w:hAnsi="Arial"/>
-          <w:sz w:val="20"/>
-          <w:szCs w:val="20"/>
-        </w:rPr>
-        <w:t xml:space="preserve">QtyNameIdent. Numb.ClassificationRegistration Number</w:t>
-      </w:r>
-    </w:p>
-    <w:p>
-      <w:pPr>
-        <w:spacing w:after="80"/>
-      </w:pPr>
-      <w:r>
-        <w:rPr>
-          <w:rFonts w:ascii="Arial" w:cs="Arial" w:eastAsia="Arial" w:hAnsi="Arial"/>
-          <w:sz w:val="20"/>
-          <w:szCs w:val="20"/>
-        </w:rPr>
-        <w:t xml:space="preserve">≥0.1-&lt;0.25 %4-tert-butylcyclohexyl acetateCAS:32210-23-4 ((4-tert-butylcyclohexyl) acetate)</w:t>
-      </w:r>
-    </w:p>
-    <w:p>
-      <w:pPr>
-        <w:spacing w:after="80"/>
-      </w:pPr>
-      <w:r>
-        <w:rPr>
-          <w:rFonts w:ascii="Arial" w:cs="Arial" w:eastAsia="Arial" w:hAnsi="Arial"/>
-          <w:sz w:val="20"/>
-          <w:szCs w:val="20"/>
-        </w:rPr>
-        <w:t xml:space="preserve">EC:250-954-9</w:t>
-      </w:r>
-    </w:p>
-    <w:p>
-      <w:pPr>
-        <w:spacing w:after="80"/>
-      </w:pPr>
-      <w:r>
-        <w:rPr>
-          <w:rFonts w:ascii="Arial" w:cs="Arial" w:eastAsia="Arial" w:hAnsi="Arial"/>
-          <w:sz w:val="20"/>
-          <w:szCs w:val="20"/>
-        </w:rPr>
-        <w:t xml:space="preserve">Skin Sens. 1B, H31701-2119976286-24-XXXX</w:t>
-      </w:r>
-    </w:p>
-    <w:p>
-      <w:pPr>
-        <w:spacing w:after="80"/>
-      </w:pPr>
-      <w:r>
-        <w:rPr>
-          <w:rFonts w:ascii="Arial" w:cs="Arial" w:eastAsia="Arial" w:hAnsi="Arial"/>
-          <w:sz w:val="20"/>
-          <w:szCs w:val="20"/>
-        </w:rPr>
-        <w:t xml:space="preserve">≥0.001-&lt;0.01%cinnamaldehydeCAS:104-55-2 ((E)-3-phenylprop-2-enal)</w:t>
-      </w:r>
-    </w:p>
-    <w:p>
-      <w:pPr>
-        <w:spacing w:after="80"/>
-      </w:pPr>
-      <w:r>
-        <w:rPr>
-          <w:rFonts w:ascii="Arial" w:cs="Arial" w:eastAsia="Arial" w:hAnsi="Arial"/>
-          <w:sz w:val="20"/>
-          <w:szCs w:val="20"/>
-        </w:rPr>
-        <w:t xml:space="preserve">EC:203-213-9</w:t>
-      </w:r>
-    </w:p>
-    <w:p>
-      <w:pPr>
-        <w:spacing w:after="80"/>
-      </w:pPr>
-      <w:r>
-        <w:rPr>
-          <w:rFonts w:ascii="Arial" w:cs="Arial" w:eastAsia="Arial" w:hAnsi="Arial"/>
-          <w:sz w:val="20"/>
-          <w:szCs w:val="20"/>
-        </w:rPr>
-        <w:t xml:space="preserve">Index:606-155-00-6</w:t>
-      </w:r>
-    </w:p>
-    <w:p>
-      <w:pPr>
-        <w:spacing w:after="80"/>
-      </w:pPr>
-      <w:r>
-        <w:rPr>
-          <w:rFonts w:ascii="Arial" w:cs="Arial" w:eastAsia="Arial" w:hAnsi="Arial"/>
-          <w:sz w:val="20"/>
-          <w:szCs w:val="20"/>
-        </w:rPr>
-        <w:t xml:space="preserve">Skin Sens. 1A, H317</w:t>
-      </w:r>
-    </w:p>
-    <w:p>
-      <w:pPr>
-        <w:spacing w:after="80"/>
-      </w:pPr>
-      <w:r>
-        <w:rPr>
-          <w:rFonts w:ascii="Arial" w:cs="Arial" w:eastAsia="Arial" w:hAnsi="Arial"/>
-          <w:sz w:val="20"/>
-          <w:szCs w:val="20"/>
-        </w:rPr>
-        <w:t xml:space="preserve">Specific Concentration Limits:</w:t>
-      </w:r>
-    </w:p>
-    <w:p>
-      <w:pPr>
-        <w:spacing w:after="80"/>
-      </w:pPr>
-      <w:r>
-        <w:rPr>
-          <w:rFonts w:ascii="Arial" w:cs="Arial" w:eastAsia="Arial" w:hAnsi="Arial"/>
-          <w:sz w:val="20"/>
-          <w:szCs w:val="20"/>
-        </w:rPr>
-        <w:t xml:space="preserve">C ≥ 0.01%: Skin Sens. 1A H317</w:t>
-      </w:r>
-    </w:p>
-    <w:p>
-      <w:pPr>
-        <w:spacing w:after="80"/>
-      </w:pPr>
-      <w:r>
-        <w:rPr>
-          <w:rFonts w:ascii="Arial" w:cs="Arial" w:eastAsia="Arial" w:hAnsi="Arial"/>
-          <w:sz w:val="20"/>
-          <w:szCs w:val="20"/>
-        </w:rPr>
-        <w:t xml:space="preserve">01-2119935242-45-XXXX</w:t>
-      </w:r>
-    </w:p>
-    <w:p>
-      <w:pPr>
-        <w:spacing w:after="80"/>
-      </w:pPr>
-      <w:r>
-        <w:rPr>
-          <w:rFonts w:ascii="Arial" w:cs="Arial" w:eastAsia="Arial" w:hAnsi="Arial"/>
-          <w:sz w:val="20"/>
-          <w:szCs w:val="20"/>
-        </w:rPr>
-        <w:t xml:space="preserve">&lt; 0.00093%reaction mass of 5-chloro-2-</w:t>
-      </w:r>
-    </w:p>
-    <w:p>
-      <w:pPr>
-        <w:spacing w:after="80"/>
-      </w:pPr>
-      <w:r>
-        <w:rPr>
-          <w:rFonts w:ascii="Arial" w:cs="Arial" w:eastAsia="Arial" w:hAnsi="Arial"/>
-          <w:sz w:val="20"/>
-          <w:szCs w:val="20"/>
-        </w:rPr>
-        <w:t xml:space="preserve">methyl-2H-isothiazol-3-one and 2-</w:t>
-      </w:r>
-    </w:p>
-    <w:p>
-      <w:pPr>
-        <w:spacing w:after="80"/>
-      </w:pPr>
-      <w:r>
-        <w:rPr>
-          <w:rFonts w:ascii="Arial" w:cs="Arial" w:eastAsia="Arial" w:hAnsi="Arial"/>
-          <w:sz w:val="20"/>
-          <w:szCs w:val="20"/>
-        </w:rPr>
-        <w:t xml:space="preserve">methyl-2H-isothiazol-3-one (3:1)</w:t>
-      </w:r>
-    </w:p>
-    <w:p>
-      <w:pPr>
-        <w:spacing w:after="80"/>
-      </w:pPr>
-      <w:r>
-        <w:rPr>
-          <w:rFonts w:ascii="Arial" w:cs="Arial" w:eastAsia="Arial" w:hAnsi="Arial"/>
-          <w:sz w:val="20"/>
-          <w:szCs w:val="20"/>
-        </w:rPr>
-        <w:t xml:space="preserve">CAS:55965-84-9 (5-chloro-2-methyl-1,2-thiazol-3-one;2-methyl-1,2-thiazol-3-one)</w:t>
-      </w:r>
-    </w:p>
-    <w:p>
-      <w:pPr>
-        <w:spacing w:after="80"/>
-      </w:pPr>
-      <w:r>
-        <w:rPr>
-          <w:rFonts w:ascii="Arial" w:cs="Arial" w:eastAsia="Arial" w:hAnsi="Arial"/>
-          <w:sz w:val="20"/>
-          <w:szCs w:val="20"/>
-        </w:rPr>
-        <w:t xml:space="preserve">EC:911-418-6</w:t>
-      </w:r>
-    </w:p>
-    <w:p>
-      <w:pPr>
-        <w:spacing w:after="80"/>
-      </w:pPr>
-      <w:r>
-        <w:rPr>
-          <w:rFonts w:ascii="Arial" w:cs="Arial" w:eastAsia="Arial" w:hAnsi="Arial"/>
-          <w:sz w:val="20"/>
-          <w:szCs w:val="20"/>
-        </w:rPr>
-        <w:t xml:space="preserve">Index:613-167-00-5</w:t>
-      </w:r>
-    </w:p>
-    <w:p>
-      <w:pPr>
-        <w:spacing w:after="80"/>
-      </w:pPr>
-      <w:r>
-        <w:rPr>
-          <w:rFonts w:ascii="Arial" w:cs="Arial" w:eastAsia="Arial" w:hAnsi="Arial"/>
-          <w:sz w:val="20"/>
-          <w:szCs w:val="20"/>
-        </w:rPr>
-        <w:t xml:space="preserve">Acute Tox. 2, H330; Acute Tox. 2,</w:t>
-      </w:r>
-    </w:p>
-    <w:p>
-      <w:pPr>
-        <w:spacing w:after="80"/>
-      </w:pPr>
-      <w:r>
-        <w:rPr>
-          <w:rFonts w:ascii="Arial" w:cs="Arial" w:eastAsia="Arial" w:hAnsi="Arial"/>
-          <w:sz w:val="20"/>
-          <w:szCs w:val="20"/>
-        </w:rPr>
-        <w:t xml:space="preserve">H310; Acute Tox. 3, H301; Skin</w:t>
-      </w:r>
-    </w:p>
-    <w:p>
-      <w:pPr>
-        <w:spacing w:after="80"/>
-      </w:pPr>
-      <w:r>
-        <w:rPr>
-          <w:rFonts w:ascii="Arial" w:cs="Arial" w:eastAsia="Arial" w:hAnsi="Arial"/>
-          <w:sz w:val="20"/>
-          <w:szCs w:val="20"/>
-        </w:rPr>
-        <w:t xml:space="preserve">Corr. 1C, H314; Eye Dam. 1,</w:t>
-      </w:r>
-    </w:p>
-    <w:p>
-      <w:pPr>
-        <w:spacing w:after="80"/>
-      </w:pPr>
-      <w:r>
-        <w:rPr>
-          <w:rFonts w:ascii="Arial" w:cs="Arial" w:eastAsia="Arial" w:hAnsi="Arial"/>
-          <w:sz w:val="20"/>
-          <w:szCs w:val="20"/>
-        </w:rPr>
-        <w:t xml:space="preserve">H318; Skin Sens. 1A, H317;</w:t>
-      </w:r>
-    </w:p>
-    <w:p>
-      <w:pPr>
-        <w:spacing w:after="80"/>
-      </w:pPr>
-      <w:r>
-        <w:rPr>
-          <w:rFonts w:ascii="Arial" w:cs="Arial" w:eastAsia="Arial" w:hAnsi="Arial"/>
-          <w:sz w:val="20"/>
-          <w:szCs w:val="20"/>
-        </w:rPr>
-        <w:t xml:space="preserve">Stwarzające zagrożenie dla środowiska wodnego - kategoria ostra 1, H400; Aquatic</w:t>
-      </w:r>
-    </w:p>
-    <w:p>
-      <w:pPr>
-        <w:spacing w:after="80"/>
-      </w:pPr>
-      <w:r>
-        <w:rPr>
-          <w:rFonts w:ascii="Arial" w:cs="Arial" w:eastAsia="Arial" w:hAnsi="Arial"/>
-          <w:sz w:val="20"/>
-          <w:szCs w:val="20"/>
-        </w:rPr>
-        <w:t xml:space="preserve">Chronic 1, H410, M-Chronic:100,</w:t>
-      </w:r>
-    </w:p>
-    <w:p>
-      <w:pPr>
-        <w:spacing w:after="80"/>
-      </w:pPr>
-      <w:r>
-        <w:rPr>
-          <w:rFonts w:ascii="Arial" w:cs="Arial" w:eastAsia="Arial" w:hAnsi="Arial"/>
-          <w:sz w:val="20"/>
-          <w:szCs w:val="20"/>
-        </w:rPr>
-        <w:t xml:space="preserve">M-Acute:100, EUH071</w:t>
-      </w:r>
-    </w:p>
-    <w:p>
-      <w:pPr>
-        <w:spacing w:after="80"/>
-      </w:pPr>
-      <w:r>
-        <w:rPr>
-          <w:rFonts w:ascii="Arial" w:cs="Arial" w:eastAsia="Arial" w:hAnsi="Arial"/>
-          <w:sz w:val="20"/>
-          <w:szCs w:val="20"/>
-        </w:rPr>
-        <w:t xml:space="preserve">Specific Concentration Limits:</w:t>
-      </w:r>
-    </w:p>
-    <w:p>
-      <w:pPr>
-        <w:spacing w:after="80"/>
-      </w:pPr>
-      <w:r>
-        <w:rPr>
-          <w:rFonts w:ascii="Arial" w:cs="Arial" w:eastAsia="Arial" w:hAnsi="Arial"/>
-          <w:sz w:val="20"/>
-          <w:szCs w:val="20"/>
-        </w:rPr>
-        <w:t xml:space="preserve">C ≥ 0.6%: Skin Corr. 1C H314</w:t>
-      </w:r>
-    </w:p>
-    <w:p>
-      <w:pPr>
-        <w:spacing w:after="80"/>
-      </w:pPr>
-      <w:r>
-        <w:rPr>
-          <w:rFonts w:ascii="Arial" w:cs="Arial" w:eastAsia="Arial" w:hAnsi="Arial"/>
-          <w:sz w:val="20"/>
-          <w:szCs w:val="20"/>
-        </w:rPr>
-        <w:t xml:space="preserve">0.06% ≤ C &lt; 0.6%: Skin Irrit. 2</w:t>
-      </w:r>
-    </w:p>
-    <w:p>
-      <w:pPr>
-        <w:spacing w:after="80"/>
-      </w:pPr>
-      <w:r>
-        <w:rPr>
-          <w:rFonts w:ascii="Arial" w:cs="Arial" w:eastAsia="Arial" w:hAnsi="Arial"/>
-          <w:sz w:val="20"/>
-          <w:szCs w:val="20"/>
-        </w:rPr>
-        <w:t xml:space="preserve">H315</w:t>
-      </w:r>
-    </w:p>
-    <w:p>
-      <w:pPr>
-        <w:spacing w:after="80"/>
-      </w:pPr>
-      <w:r>
-        <w:rPr>
-          <w:rFonts w:ascii="Arial" w:cs="Arial" w:eastAsia="Arial" w:hAnsi="Arial"/>
-          <w:sz w:val="20"/>
-          <w:szCs w:val="20"/>
-        </w:rPr>
-        <w:t xml:space="preserve">C ≥ 0.6%: Eye Dam. 1 H318</w:t>
-      </w:r>
-    </w:p>
-    <w:p>
-      <w:pPr>
-        <w:spacing w:after="80"/>
-      </w:pPr>
-      <w:r>
-        <w:rPr>
-          <w:rFonts w:ascii="Arial" w:cs="Arial" w:eastAsia="Arial" w:hAnsi="Arial"/>
-          <w:sz w:val="20"/>
-          <w:szCs w:val="20"/>
-        </w:rPr>
-        <w:t xml:space="preserve">0.06% ≤ C &lt; 0.6%: Eye Irrit. 2</w:t>
-      </w:r>
-    </w:p>
-    <w:p>
-      <w:pPr>
-        <w:spacing w:after="80"/>
-      </w:pPr>
-      <w:r>
-        <w:rPr>
-          <w:rFonts w:ascii="Arial" w:cs="Arial" w:eastAsia="Arial" w:hAnsi="Arial"/>
-          <w:sz w:val="20"/>
-          <w:szCs w:val="20"/>
-        </w:rPr>
-        <w:t xml:space="preserve">H319</w:t>
-      </w:r>
-    </w:p>
-    <w:p>
-      <w:pPr>
-        <w:spacing w:after="80"/>
-      </w:pPr>
-      <w:r>
-        <w:rPr>
-          <w:rFonts w:ascii="Arial" w:cs="Arial" w:eastAsia="Arial" w:hAnsi="Arial"/>
-          <w:sz w:val="20"/>
-          <w:szCs w:val="20"/>
-        </w:rPr>
-        <w:t xml:space="preserve">C ≥ 0.0015%: Skin Sens. 1A H317</w:t>
-      </w:r>
-    </w:p>
-    <w:p>
-      <w:pPr>
-        <w:spacing w:after="80"/>
-      </w:pPr>
-      <w:r>
-        <w:rPr>
-          <w:rFonts w:ascii="Arial" w:cs="Arial" w:eastAsia="Arial" w:hAnsi="Arial"/>
-          <w:sz w:val="20"/>
-          <w:szCs w:val="20"/>
-        </w:rPr>
-        <w:t xml:space="preserve">01-2120764691-48-XXXX</w:t>
+        <w:spacing w:after="100" w:before="180"/>
+      </w:pPr>
+      <w:r>
+        <w:rPr>
+          <w:rFonts w:ascii="Arial" w:cs="Arial" w:eastAsia="Arial" w:hAnsi="Arial"/>
+          <w:b/>
+          <w:bCs/>
+          <w:sz w:val="20"/>
+          <w:szCs w:val="20"/>
+        </w:rPr>
+        <w:t xml:space="preserve">3.1. Substancje: Nie dotyczy.</w:t>
+      </w:r>
+    </w:p>
+    <w:p>
+      <w:pPr>
+        <w:spacing w:after="80" w:before="180"/>
+      </w:pPr>
+      <w:r>
+        <w:rPr>
+          <w:rFonts w:ascii="Arial" w:cs="Arial" w:eastAsia="Arial" w:hAnsi="Arial"/>
+          <w:b/>
+          <w:bCs/>
+          <w:sz w:val="20"/>
+          <w:szCs w:val="20"/>
+        </w:rPr>
+        <w:t xml:space="preserve">3.2. Mieszaniny</w:t>
+      </w:r>
+    </w:p>
+    <w:p>
+      <w:pPr>
+        <w:spacing w:after="150"/>
+      </w:pPr>
+      <w:r>
+        <w:rPr>
+          <w:rFonts w:ascii="Arial" w:cs="Arial" w:eastAsia="Arial" w:hAnsi="Arial"/>
+          <w:sz w:val="20"/>
+          <w:szCs w:val="20"/>
+        </w:rPr>
+        <w:t xml:space="preserve">Opis chemiczny: Mieszanina substancji niebezpiecznych wraz z dodatkami nieniebezpiecznymi.</w:t>
+      </w:r>
+    </w:p>
+    <w:tbl>
+      <w:tblPr>
+        <w:tblW w:type="dxa" w:w="9600"/>
+        <w:tblBorders>
+          <w:top w:val="single" w:color="CCCCCC" w:sz="4"/>
+          <w:left w:val="single" w:color="CCCCCC" w:sz="4"/>
+          <w:bottom w:val="single" w:color="CCCCCC" w:sz="4"/>
+          <w:right w:val="single" w:color="CCCCCC" w:sz="4"/>
+          <w:insideH w:val="single" w:color="E0E0E0" w:sz="4"/>
+          <w:insideV w:val="single" w:color="E0E0E0" w:sz="4"/>
+        </w:tblBorders>
+      </w:tblPr>
+      <w:tblGrid>
+        <w:gridCol w:w="100"/>
+        <w:gridCol w:w="100"/>
+        <w:gridCol w:w="100"/>
+        <w:gridCol w:w="100"/>
+      </w:tblGrid>
+      <w:tr>
+        <w:trPr>
+          <w:tblHeader/>
+        </w:trPr>
+        <w:tc>
+          <w:tcPr>
+            <w:tcW w:type="dxa" w:w="2800"/>
+            <w:shd w:fill="F2F4F7"/>
+          </w:tcPr>
+          <w:p>
+            <w:r>
+              <w:rPr>
+                <w:rFonts w:ascii="Arial" w:cs="Arial" w:eastAsia="Arial" w:hAnsi="Arial"/>
+                <w:b/>
+                <w:bCs/>
+                <w:sz w:val="18"/>
+                <w:szCs w:val="18"/>
+              </w:rPr>
+              <w:t xml:space="preserve">Nazwa substancji</w:t>
+            </w:r>
+          </w:p>
+        </w:tc>
+        <w:tc>
+          <w:tcPr>
+            <w:tcW w:type="dxa" w:w="2600"/>
+            <w:shd w:fill="F2F4F7"/>
+          </w:tcPr>
+          <w:p>
+            <w:r>
+              <w:rPr>
+                <w:rFonts w:ascii="Arial" w:cs="Arial" w:eastAsia="Arial" w:hAnsi="Arial"/>
+                <w:b/>
+                <w:bCs/>
+                <w:sz w:val="18"/>
+                <w:szCs w:val="18"/>
+              </w:rPr>
+              <w:t xml:space="preserve">Identyfikatory</w:t>
+            </w:r>
+          </w:p>
+        </w:tc>
+        <w:tc>
+          <w:tcPr>
+            <w:tcW w:type="dxa" w:w="2800"/>
+            <w:shd w:fill="F2F4F7"/>
+          </w:tcPr>
+          <w:p>
+            <w:r>
+              <w:rPr>
+                <w:rFonts w:ascii="Arial" w:cs="Arial" w:eastAsia="Arial" w:hAnsi="Arial"/>
+                <w:b/>
+                <w:bCs/>
+                <w:sz w:val="18"/>
+                <w:szCs w:val="18"/>
+              </w:rPr>
+              <w:t xml:space="preserve">Klasyfikacja CLP</w:t>
+            </w:r>
+          </w:p>
+        </w:tc>
+        <w:tc>
+          <w:tcPr>
+            <w:tcW w:type="dxa" w:w="1400"/>
+            <w:shd w:fill="F2F4F7"/>
+          </w:tcPr>
+          <w:p>
+            <w:r>
+              <w:rPr>
+                <w:rFonts w:ascii="Arial" w:cs="Arial" w:eastAsia="Arial" w:hAnsi="Arial"/>
+                <w:b/>
+                <w:bCs/>
+                <w:sz w:val="18"/>
+                <w:szCs w:val="18"/>
+              </w:rPr>
+              <w:t xml:space="preserve">Stężenie</w:t>
+            </w:r>
+          </w:p>
+        </w:tc>
+      </w:tr>
+      <w:tr>
+        <w:tc>
+          <w:tcPr>
+            <w:tcW w:type="dxa" w:w="2800"/>
+          </w:tcPr>
+          <w:p>
+            <w:pPr>
+              <w:spacing w:after="40"/>
+            </w:pPr>
+            <w:r>
+              <w:rPr>
+                <w:rFonts w:ascii="Arial" w:cs="Arial" w:eastAsia="Arial" w:hAnsi="Arial"/>
+                <w:b/>
+                <w:bCs/>
+                <w:sz w:val="18"/>
+                <w:szCs w:val="18"/>
+              </w:rPr>
+              <w:t xml:space="preserve">octan 4-tert-butylocykloheksylu</w:t>
+            </w:r>
+          </w:p>
+          <w:p>
+            <w:r>
+              <w:rPr>
+                <w:rFonts w:ascii="Arial" w:cs="Arial" w:eastAsia="Arial" w:hAnsi="Arial"/>
+                <w:i/>
+                <w:iCs/>
+                <w:color w:val="666666"/>
+                <w:sz w:val="16"/>
+                <w:szCs w:val="16"/>
+              </w:rPr>
+              <w:t xml:space="preserve">(ang. 4-tert-butylcyclohexyl acetate)</w:t>
+            </w:r>
+          </w:p>
+        </w:tc>
+        <w:tc>
+          <w:tcPr>
+            <w:tcW w:type="dxa" w:w="2600"/>
+          </w:tcPr>
+          <w:p>
+            <w:pPr>
+              <w:spacing w:after="40"/>
+            </w:pPr>
+            <w:r>
+              <w:rPr>
+                <w:rFonts w:ascii="Arial" w:cs="Arial" w:eastAsia="Arial" w:hAnsi="Arial"/>
+                <w:sz w:val="17"/>
+                <w:szCs w:val="17"/>
+              </w:rPr>
+              <w:t xml:space="preserve">Numer CAS: 32210-23-4</w:t>
+            </w:r>
+          </w:p>
+          <w:p>
+            <w:pPr>
+              <w:spacing w:after="40"/>
+            </w:pPr>
+            <w:r>
+              <w:rPr>
+                <w:rFonts w:ascii="Arial" w:cs="Arial" w:eastAsia="Arial" w:hAnsi="Arial"/>
+                <w:sz w:val="17"/>
+                <w:szCs w:val="17"/>
+              </w:rPr>
+              <w:t xml:space="preserve">Numer WE: 250-954-9</w:t>
+            </w:r>
+          </w:p>
+          <w:p>
+            <w:pPr>
+              <w:spacing w:after="40"/>
+            </w:pPr>
+            <w:r>
+              <w:rPr>
+                <w:rFonts w:ascii="Arial" w:cs="Arial" w:eastAsia="Arial" w:hAnsi="Arial"/>
+                <w:sz w:val="17"/>
+                <w:szCs w:val="17"/>
+              </w:rPr>
+              <w:t xml:space="preserve">Numer rejestracji REACH:</w:t>
+            </w:r>
+          </w:p>
+          <w:p>
+            <w:pPr>
+              <w:spacing w:after="40"/>
+            </w:pPr>
+            <w:r>
+              <w:rPr>
+                <w:rFonts w:ascii="Arial" w:cs="Arial" w:eastAsia="Arial" w:hAnsi="Arial"/>
+                <w:sz w:val="17"/>
+                <w:szCs w:val="17"/>
+              </w:rPr>
+              <w:t xml:space="preserve">01-2119976286-24-XXXX</w:t>
+            </w:r>
+          </w:p>
+        </w:tc>
+        <w:tc>
+          <w:tcPr>
+            <w:tcW w:type="dxa" w:w="2800"/>
+          </w:tcPr>
+          <w:p>
+            <w:pPr>
+              <w:spacing w:after="40"/>
+            </w:pPr>
+            <w:r>
+              <w:rPr>
+                <w:rFonts w:ascii="Arial" w:cs="Arial" w:eastAsia="Arial" w:hAnsi="Arial"/>
+                <w:sz w:val="17"/>
+                <w:szCs w:val="17"/>
+              </w:rPr>
+              <w:t xml:space="preserve">Skin Sens. 1B, H317</w:t>
+            </w:r>
+          </w:p>
+        </w:tc>
+        <w:tc>
+          <w:tcPr>
+            <w:tcW w:type="dxa" w:w="1400"/>
+          </w:tcPr>
+          <w:p>
+            <w:r>
+              <w:rPr>
+                <w:rFonts w:ascii="Arial" w:cs="Arial" w:eastAsia="Arial" w:hAnsi="Arial"/>
+                <w:sz w:val="18"/>
+                <w:szCs w:val="18"/>
+              </w:rPr>
+              <w:t xml:space="preserve">≥ 0,1 - &lt; 0,25 %</w:t>
+            </w:r>
+          </w:p>
+        </w:tc>
+      </w:tr>
+      <w:tr>
+        <w:tc>
+          <w:tcPr>
+            <w:tcW w:type="dxa" w:w="2800"/>
+          </w:tcPr>
+          <w:p>
+            <w:pPr>
+              <w:spacing w:after="40"/>
+            </w:pPr>
+            <w:r>
+              <w:rPr>
+                <w:rFonts w:ascii="Arial" w:cs="Arial" w:eastAsia="Arial" w:hAnsi="Arial"/>
+                <w:b/>
+                <w:bCs/>
+                <w:sz w:val="18"/>
+                <w:szCs w:val="18"/>
+              </w:rPr>
+              <w:t xml:space="preserve">aldehyd cynamonowy</w:t>
+            </w:r>
+          </w:p>
+          <w:p>
+            <w:r>
+              <w:rPr>
+                <w:rFonts w:ascii="Arial" w:cs="Arial" w:eastAsia="Arial" w:hAnsi="Arial"/>
+                <w:i/>
+                <w:iCs/>
+                <w:color w:val="666666"/>
+                <w:sz w:val="16"/>
+                <w:szCs w:val="16"/>
+              </w:rPr>
+              <w:t xml:space="preserve">(ang. cinnamaldehyde)</w:t>
+            </w:r>
+          </w:p>
+        </w:tc>
+        <w:tc>
+          <w:tcPr>
+            <w:tcW w:type="dxa" w:w="2600"/>
+          </w:tcPr>
+          <w:p>
+            <w:pPr>
+              <w:spacing w:after="40"/>
+            </w:pPr>
+            <w:r>
+              <w:rPr>
+                <w:rFonts w:ascii="Arial" w:cs="Arial" w:eastAsia="Arial" w:hAnsi="Arial"/>
+                <w:sz w:val="17"/>
+                <w:szCs w:val="17"/>
+              </w:rPr>
+              <w:t xml:space="preserve">Numer CAS: 104-55-2</w:t>
+            </w:r>
+          </w:p>
+          <w:p>
+            <w:pPr>
+              <w:spacing w:after="40"/>
+            </w:pPr>
+            <w:r>
+              <w:rPr>
+                <w:rFonts w:ascii="Arial" w:cs="Arial" w:eastAsia="Arial" w:hAnsi="Arial"/>
+                <w:sz w:val="17"/>
+                <w:szCs w:val="17"/>
+              </w:rPr>
+              <w:t xml:space="preserve">Numer WE: 203-213-9</w:t>
+            </w:r>
+          </w:p>
+          <w:p>
+            <w:pPr>
+              <w:spacing w:after="40"/>
+            </w:pPr>
+            <w:r>
+              <w:rPr>
+                <w:rFonts w:ascii="Arial" w:cs="Arial" w:eastAsia="Arial" w:hAnsi="Arial"/>
+                <w:sz w:val="17"/>
+                <w:szCs w:val="17"/>
+              </w:rPr>
+              <w:t xml:space="preserve">Numer indeksowy: 606-155-00-6</w:t>
+            </w:r>
+          </w:p>
+          <w:p>
+            <w:pPr>
+              <w:spacing w:after="40"/>
+            </w:pPr>
+            <w:r>
+              <w:rPr>
+                <w:rFonts w:ascii="Arial" w:cs="Arial" w:eastAsia="Arial" w:hAnsi="Arial"/>
+                <w:sz w:val="17"/>
+                <w:szCs w:val="17"/>
+              </w:rPr>
+              <w:t xml:space="preserve">Numer rejestracji REACH:</w:t>
+            </w:r>
+          </w:p>
+          <w:p>
+            <w:pPr>
+              <w:spacing w:after="40"/>
+            </w:pPr>
+            <w:r>
+              <w:rPr>
+                <w:rFonts w:ascii="Arial" w:cs="Arial" w:eastAsia="Arial" w:hAnsi="Arial"/>
+                <w:sz w:val="17"/>
+                <w:szCs w:val="17"/>
+              </w:rPr>
+              <w:t xml:space="preserve">01-2119935242-45-XXXX</w:t>
+            </w:r>
+          </w:p>
+        </w:tc>
+        <w:tc>
+          <w:tcPr>
+            <w:tcW w:type="dxa" w:w="2800"/>
+          </w:tcPr>
+          <w:p>
+            <w:pPr>
+              <w:spacing w:after="40"/>
+            </w:pPr>
+            <w:r>
+              <w:rPr>
+                <w:rFonts w:ascii="Arial" w:cs="Arial" w:eastAsia="Arial" w:hAnsi="Arial"/>
+                <w:sz w:val="17"/>
+                <w:szCs w:val="17"/>
+              </w:rPr>
+              <w:t xml:space="preserve">Skin Sens. 1A, H317</w:t>
+            </w:r>
+          </w:p>
+          <w:p>
+            <w:pPr>
+              <w:spacing w:after="40"/>
+            </w:pPr>
+            <w:r>
+              <w:rPr>
+                <w:rFonts w:ascii="Arial" w:cs="Arial" w:eastAsia="Arial" w:hAnsi="Arial"/>
+                <w:sz w:val="17"/>
+                <w:szCs w:val="17"/>
+              </w:rPr>
+              <w:t xml:space="preserve">Specyficzne stężenia graniczne:</w:t>
+            </w:r>
+          </w:p>
+          <w:p>
+            <w:pPr>
+              <w:spacing w:after="40"/>
+            </w:pPr>
+            <w:r>
+              <w:rPr>
+                <w:rFonts w:ascii="Arial" w:cs="Arial" w:eastAsia="Arial" w:hAnsi="Arial"/>
+                <w:sz w:val="17"/>
+                <w:szCs w:val="17"/>
+              </w:rPr>
+              <w:t xml:space="preserve">C ≥ 0.01%: Skin Sens. 1A H317</w:t>
+            </w:r>
+          </w:p>
+        </w:tc>
+        <w:tc>
+          <w:tcPr>
+            <w:tcW w:type="dxa" w:w="1400"/>
+          </w:tcPr>
+          <w:p>
+            <w:r>
+              <w:rPr>
+                <w:rFonts w:ascii="Arial" w:cs="Arial" w:eastAsia="Arial" w:hAnsi="Arial"/>
+                <w:sz w:val="18"/>
+                <w:szCs w:val="18"/>
+              </w:rPr>
+              <w:t xml:space="preserve">≥ 0,001 - &lt; 0,01 %</w:t>
+            </w:r>
+          </w:p>
+        </w:tc>
+      </w:tr>
+      <w:tr>
+        <w:tc>
+          <w:tcPr>
+            <w:tcW w:type="dxa" w:w="2800"/>
+          </w:tcPr>
+          <w:p>
+            <w:pPr>
+              <w:spacing w:after="40"/>
+            </w:pPr>
+            <w:r>
+              <w:rPr>
+                <w:rFonts w:ascii="Arial" w:cs="Arial" w:eastAsia="Arial" w:hAnsi="Arial"/>
+                <w:b/>
+                <w:bCs/>
+                <w:sz w:val="18"/>
+                <w:szCs w:val="18"/>
+              </w:rPr>
+              <w:t xml:space="preserve">masa poreakcyjna 5-chloro-2-metylo-2H-izotiazol-3-onu i 2-metylo-2H-izotiazol-3-onu (3:1)</w:t>
+            </w:r>
+          </w:p>
+          <w:p>
+            <w:r>
+              <w:rPr>
+                <w:rFonts w:ascii="Arial" w:cs="Arial" w:eastAsia="Arial" w:hAnsi="Arial"/>
+                <w:i/>
+                <w:iCs/>
+                <w:color w:val="666666"/>
+                <w:sz w:val="16"/>
+                <w:szCs w:val="16"/>
+              </w:rPr>
+              <w:t xml:space="preserve">(ang. reaction mass of 5-chloro-2-methyl-2H-isothiazol-3-one and 2-methyl-2H-isothiazol-3-one (3:1))</w:t>
+            </w:r>
+          </w:p>
+        </w:tc>
+        <w:tc>
+          <w:tcPr>
+            <w:tcW w:type="dxa" w:w="2600"/>
+          </w:tcPr>
+          <w:p>
+            <w:pPr>
+              <w:spacing w:after="40"/>
+            </w:pPr>
+            <w:r>
+              <w:rPr>
+                <w:rFonts w:ascii="Arial" w:cs="Arial" w:eastAsia="Arial" w:hAnsi="Arial"/>
+                <w:sz w:val="17"/>
+                <w:szCs w:val="17"/>
+              </w:rPr>
+              <w:t xml:space="preserve">Numer CAS: 55965-84-9</w:t>
+            </w:r>
+          </w:p>
+          <w:p>
+            <w:pPr>
+              <w:spacing w:after="40"/>
+            </w:pPr>
+            <w:r>
+              <w:rPr>
+                <w:rFonts w:ascii="Arial" w:cs="Arial" w:eastAsia="Arial" w:hAnsi="Arial"/>
+                <w:sz w:val="17"/>
+                <w:szCs w:val="17"/>
+              </w:rPr>
+              <w:t xml:space="preserve">Numer WE: 911-418-6</w:t>
+            </w:r>
+          </w:p>
+          <w:p>
+            <w:pPr>
+              <w:spacing w:after="40"/>
+            </w:pPr>
+            <w:r>
+              <w:rPr>
+                <w:rFonts w:ascii="Arial" w:cs="Arial" w:eastAsia="Arial" w:hAnsi="Arial"/>
+                <w:sz w:val="17"/>
+                <w:szCs w:val="17"/>
+              </w:rPr>
+              <w:t xml:space="preserve">Numer indeksowy: 613-167-00-5</w:t>
+            </w:r>
+          </w:p>
+          <w:p>
+            <w:pPr>
+              <w:spacing w:after="40"/>
+            </w:pPr>
+            <w:r>
+              <w:rPr>
+                <w:rFonts w:ascii="Arial" w:cs="Arial" w:eastAsia="Arial" w:hAnsi="Arial"/>
+                <w:sz w:val="17"/>
+                <w:szCs w:val="17"/>
+              </w:rPr>
+              <w:t xml:space="preserve">Numer rejestracji REACH:</w:t>
+            </w:r>
+          </w:p>
+          <w:p>
+            <w:pPr>
+              <w:spacing w:after="40"/>
+            </w:pPr>
+            <w:r>
+              <w:rPr>
+                <w:rFonts w:ascii="Arial" w:cs="Arial" w:eastAsia="Arial" w:hAnsi="Arial"/>
+                <w:sz w:val="17"/>
+                <w:szCs w:val="17"/>
+              </w:rPr>
+              <w:t xml:space="preserve">01-2120764691-48-XXXX</w:t>
+            </w:r>
+          </w:p>
+        </w:tc>
+        <w:tc>
+          <w:tcPr>
+            <w:tcW w:type="dxa" w:w="2800"/>
+          </w:tcPr>
+          <w:p>
+            <w:pPr>
+              <w:spacing w:after="40"/>
+            </w:pPr>
+            <w:r>
+              <w:rPr>
+                <w:rFonts w:ascii="Arial" w:cs="Arial" w:eastAsia="Arial" w:hAnsi="Arial"/>
+                <w:sz w:val="17"/>
+                <w:szCs w:val="17"/>
+              </w:rPr>
+              <w:t xml:space="preserve">Acute Tox. 2, H330; Acute Tox. 2,</w:t>
+            </w:r>
+          </w:p>
+          <w:p>
+            <w:pPr>
+              <w:spacing w:after="40"/>
+            </w:pPr>
+            <w:r>
+              <w:rPr>
+                <w:rFonts w:ascii="Arial" w:cs="Arial" w:eastAsia="Arial" w:hAnsi="Arial"/>
+                <w:sz w:val="17"/>
+                <w:szCs w:val="17"/>
+              </w:rPr>
+              <w:t xml:space="preserve">H310; Acute Tox. 3, H301; Skin</w:t>
+            </w:r>
+          </w:p>
+          <w:p>
+            <w:pPr>
+              <w:spacing w:after="40"/>
+            </w:pPr>
+            <w:r>
+              <w:rPr>
+                <w:rFonts w:ascii="Arial" w:cs="Arial" w:eastAsia="Arial" w:hAnsi="Arial"/>
+                <w:sz w:val="17"/>
+                <w:szCs w:val="17"/>
+              </w:rPr>
+              <w:t xml:space="preserve">Corr. 1C, H314; Eye Dam. 1,</w:t>
+            </w:r>
+          </w:p>
+          <w:p>
+            <w:pPr>
+              <w:spacing w:after="40"/>
+            </w:pPr>
+            <w:r>
+              <w:rPr>
+                <w:rFonts w:ascii="Arial" w:cs="Arial" w:eastAsia="Arial" w:hAnsi="Arial"/>
+                <w:sz w:val="17"/>
+                <w:szCs w:val="17"/>
+              </w:rPr>
+              <w:t xml:space="preserve">H318; Skin Sens. 1A, H317;</w:t>
+            </w:r>
+          </w:p>
+          <w:p>
+            <w:pPr>
+              <w:spacing w:after="40"/>
+            </w:pPr>
+            <w:r>
+              <w:rPr>
+                <w:rFonts w:ascii="Arial" w:cs="Arial" w:eastAsia="Arial" w:hAnsi="Arial"/>
+                <w:sz w:val="17"/>
+                <w:szCs w:val="17"/>
+              </w:rPr>
+              <w:t xml:space="preserve">Stwarzające zagrożenie dla środowiska wodnego - kategoria ostra 1, H400; Stwarzające zagrożenie dla środowiska wodnego - kategoria przewlekła 1, H410, M (przewlekły) = 100,</w:t>
+            </w:r>
+          </w:p>
+          <w:p>
+            <w:pPr>
+              <w:spacing w:after="40"/>
+            </w:pPr>
+            <w:r>
+              <w:rPr>
+                <w:rFonts w:ascii="Arial" w:cs="Arial" w:eastAsia="Arial" w:hAnsi="Arial"/>
+                <w:sz w:val="17"/>
+                <w:szCs w:val="17"/>
+              </w:rPr>
+              <w:t xml:space="preserve">M (ostry) = 100, EUH071</w:t>
+            </w:r>
+          </w:p>
+          <w:p>
+            <w:pPr>
+              <w:spacing w:after="40"/>
+            </w:pPr>
+            <w:r>
+              <w:rPr>
+                <w:rFonts w:ascii="Arial" w:cs="Arial" w:eastAsia="Arial" w:hAnsi="Arial"/>
+                <w:sz w:val="17"/>
+                <w:szCs w:val="17"/>
+              </w:rPr>
+              <w:t xml:space="preserve">Specyficzne stężenia graniczne:</w:t>
+            </w:r>
+          </w:p>
+          <w:p>
+            <w:pPr>
+              <w:spacing w:after="40"/>
+            </w:pPr>
+            <w:r>
+              <w:rPr>
+                <w:rFonts w:ascii="Arial" w:cs="Arial" w:eastAsia="Arial" w:hAnsi="Arial"/>
+                <w:sz w:val="17"/>
+                <w:szCs w:val="17"/>
+              </w:rPr>
+              <w:t xml:space="preserve">C ≥ 0.6%: Skin Corr. 1C H314</w:t>
+            </w:r>
+          </w:p>
+          <w:p>
+            <w:pPr>
+              <w:spacing w:after="40"/>
+            </w:pPr>
+            <w:r>
+              <w:rPr>
+                <w:rFonts w:ascii="Arial" w:cs="Arial" w:eastAsia="Arial" w:hAnsi="Arial"/>
+                <w:sz w:val="17"/>
+                <w:szCs w:val="17"/>
+              </w:rPr>
+              <w:t xml:space="preserve">0.06% ≤ C &lt; 0.6%: Skin Irrit. 2</w:t>
+            </w:r>
+          </w:p>
+          <w:p>
+            <w:pPr>
+              <w:spacing w:after="40"/>
+            </w:pPr>
+            <w:r>
+              <w:rPr>
+                <w:rFonts w:ascii="Arial" w:cs="Arial" w:eastAsia="Arial" w:hAnsi="Arial"/>
+                <w:sz w:val="17"/>
+                <w:szCs w:val="17"/>
+              </w:rPr>
+              <w:t xml:space="preserve">H315</w:t>
+            </w:r>
+          </w:p>
+          <w:p>
+            <w:pPr>
+              <w:spacing w:after="40"/>
+            </w:pPr>
+            <w:r>
+              <w:rPr>
+                <w:rFonts w:ascii="Arial" w:cs="Arial" w:eastAsia="Arial" w:hAnsi="Arial"/>
+                <w:sz w:val="17"/>
+                <w:szCs w:val="17"/>
+              </w:rPr>
+              <w:t xml:space="preserve">C ≥ 0.6%: Eye Dam. 1 H318</w:t>
+            </w:r>
+          </w:p>
+          <w:p>
+            <w:pPr>
+              <w:spacing w:after="40"/>
+            </w:pPr>
+            <w:r>
+              <w:rPr>
+                <w:rFonts w:ascii="Arial" w:cs="Arial" w:eastAsia="Arial" w:hAnsi="Arial"/>
+                <w:sz w:val="17"/>
+                <w:szCs w:val="17"/>
+              </w:rPr>
+              <w:t xml:space="preserve">0.06% ≤ C &lt; 0.6%: Eye Irrit. 2</w:t>
+            </w:r>
+          </w:p>
+          <w:p>
+            <w:pPr>
+              <w:spacing w:after="40"/>
+            </w:pPr>
+            <w:r>
+              <w:rPr>
+                <w:rFonts w:ascii="Arial" w:cs="Arial" w:eastAsia="Arial" w:hAnsi="Arial"/>
+                <w:sz w:val="17"/>
+                <w:szCs w:val="17"/>
+              </w:rPr>
+              <w:t xml:space="preserve">H319</w:t>
+            </w:r>
+          </w:p>
+          <w:p>
+            <w:pPr>
+              <w:spacing w:after="40"/>
+            </w:pPr>
+            <w:r>
+              <w:rPr>
+                <w:rFonts w:ascii="Arial" w:cs="Arial" w:eastAsia="Arial" w:hAnsi="Arial"/>
+                <w:sz w:val="17"/>
+                <w:szCs w:val="17"/>
+              </w:rPr>
+              <w:t xml:space="preserve">C ≥ 0.0015%: Skin Sens. 1A H317</w:t>
+            </w:r>
+          </w:p>
+        </w:tc>
+        <w:tc>
+          <w:tcPr>
+            <w:tcW w:type="dxa" w:w="1400"/>
+          </w:tcPr>
+          <w:p>
+            <w:r>
+              <w:rPr>
+                <w:rFonts w:ascii="Arial" w:cs="Arial" w:eastAsia="Arial" w:hAnsi="Arial"/>
+                <w:sz w:val="18"/>
+                <w:szCs w:val="18"/>
+              </w:rPr>
+              <w:t xml:space="preserve">&lt; 0,00093 %</w:t>
+            </w:r>
+          </w:p>
+        </w:tc>
+      </w:tr>
+    </w:tbl>
+    <w:p>
+      <w:pPr>
+        <w:spacing w:after="150" w:before="180"/>
+      </w:pPr>
+      <w:r>
+        <w:rPr>
+          <w:rFonts w:ascii="Arial" w:cs="Arial" w:eastAsia="Arial" w:hAnsi="Arial"/>
+          <w:i/>
+          <w:iCs/>
+          <w:sz w:val="18"/>
+          <w:szCs w:val="18"/>
+        </w:rPr>
+        <w:t xml:space="preserve">Pełne brzmienie zwrotów H i EUH znajduje się w sekcji 16 karty charakterystyki.</w:t>
       </w:r>
     </w:p>
     <w:p>

</xml_diff>

<commit_message>
feat(sds): overhaul section 4 first aid measures per EU 2020/878 and EKOS pattern (ADR-043)
</commit_message>
<xml_diff>
--- a/docs/SDS/Karta_Charakterystyki_8051944811087_SDS_NAJMA.docx
+++ b/docs/SDS/Karta_Charakterystyki_8051944811087_SDS_NAJMA.docx
@@ -1217,7 +1217,6 @@
         <w:pBdr>
           <w:bottom w:color="00A651" w:sz="12" w:space="1"/>
         </w:pBdr>
-        <w:shd w:fill="FFF9E6" w:val="clear"/>
         <w:spacing w:after="150" w:before="300"/>
       </w:pPr>
       <w:r>
@@ -1232,58 +1231,6 @@
     </w:p>
     <w:p>
       <w:pPr>
-        <w:spacing w:after="80"/>
-      </w:pPr>
-      <w:r>
-        <w:rPr>
-          <w:rFonts w:ascii="Arial" w:cs="Arial" w:eastAsia="Arial" w:hAnsi="Arial"/>
-          <w:sz w:val="20"/>
-          <w:szCs w:val="20"/>
-        </w:rPr>
-        <w:t xml:space="preserve">[FLAGA_QUARANTINE_REVIEW] Sekcja zablokowana przez system (Zagrożenie Toksykologiczne).</w:t>
-      </w:r>
-    </w:p>
-    <w:p>
-      <w:pPr>
-        <w:spacing w:after="80"/>
-      </w:pPr>
-      <w:r>
-        <w:rPr>
-          <w:rFonts w:ascii="Arial" w:cs="Arial" w:eastAsia="Arial" w:hAnsi="Arial"/>
-          <w:sz w:val="20"/>
-          <w:szCs w:val="20"/>
-        </w:rPr>
-        <w:t xml:space="preserve">Wymagana weryfikacja przez Safety Assessora.</w:t>
-      </w:r>
-    </w:p>
-    <w:p>
-      <w:pPr>
-        <w:spacing w:after="80"/>
-      </w:pPr>
-      <w:r>
-        <w:rPr>
-          <w:rFonts w:ascii="Arial" w:cs="Arial" w:eastAsia="Arial" w:hAnsi="Arial"/>
-          <w:sz w:val="20"/>
-          <w:szCs w:val="20"/>
-        </w:rPr>
-        <w:t xml:space="preserve">ORYGINAŁ DO WERYFIKACJI:</w:t>
-      </w:r>
-    </w:p>
-    <w:p>
-      <w:pPr>
-        <w:spacing w:after="80"/>
-      </w:pPr>
-      <w:r>
-        <w:rPr>
-          <w:rFonts w:ascii="Arial" w:cs="Arial" w:eastAsia="Arial" w:hAnsi="Arial"/>
-          <w:sz w:val="20"/>
-          <w:szCs w:val="20"/>
-        </w:rPr>
-        <w:t xml:space="preserve">SECTION 4: First aid measures</w:t>
-      </w:r>
-    </w:p>
-    <w:p>
-      <w:pPr>
         <w:spacing w:after="100" w:before="200"/>
       </w:pPr>
       <w:r>
@@ -1294,137 +1241,99 @@
           <w:sz w:val="20"/>
           <w:szCs w:val="20"/>
         </w:rPr>
-        <w:t xml:space="preserve">4.1. Description of first aid measures</w:t>
-      </w:r>
-    </w:p>
-    <w:p>
-      <w:pPr>
-        <w:spacing w:after="80"/>
-      </w:pPr>
-      <w:r>
-        <w:rPr>
-          <w:rFonts w:ascii="Arial" w:cs="Arial" w:eastAsia="Arial" w:hAnsi="Arial"/>
-          <w:sz w:val="20"/>
-          <w:szCs w:val="20"/>
-        </w:rPr>
-        <w:t xml:space="preserve">In case of skin contact:</w:t>
-      </w:r>
-    </w:p>
-    <w:p>
-      <w:pPr>
-        <w:spacing w:after="80"/>
-      </w:pPr>
-      <w:r>
-        <w:rPr>
-          <w:rFonts w:ascii="Arial" w:cs="Arial" w:eastAsia="Arial" w:hAnsi="Arial"/>
-          <w:sz w:val="20"/>
-          <w:szCs w:val="20"/>
-        </w:rPr>
-        <w:t xml:space="preserve">After contact with skin, wash immediately with soap and plenty of water.</w:t>
-      </w:r>
-    </w:p>
-    <w:p>
-      <w:pPr>
-        <w:spacing w:after="80"/>
-      </w:pPr>
-      <w:r>
-        <w:rPr>
-          <w:rFonts w:ascii="Arial" w:cs="Arial" w:eastAsia="Arial" w:hAnsi="Arial"/>
-          <w:sz w:val="20"/>
-          <w:szCs w:val="20"/>
-        </w:rPr>
-        <w:t xml:space="preserve">In case of eyes contact:</w:t>
-      </w:r>
-    </w:p>
-    <w:p>
-      <w:pPr>
-        <w:spacing w:after="80"/>
-      </w:pPr>
-      <w:r>
-        <w:rPr>
-          <w:rFonts w:ascii="Arial" w:cs="Arial" w:eastAsia="Arial" w:hAnsi="Arial"/>
-          <w:sz w:val="20"/>
-          <w:szCs w:val="20"/>
-        </w:rPr>
-        <w:t xml:space="preserve">After contact with the eyes, rinse with water with the eyelids open for a sufficient length of time, then consult an opthalmologist</w:t>
-      </w:r>
-    </w:p>
-    <w:p>
-      <w:pPr>
-        <w:spacing w:after="80"/>
-      </w:pPr>
-      <w:r>
-        <w:rPr>
-          <w:rFonts w:ascii="Arial" w:cs="Arial" w:eastAsia="Arial" w:hAnsi="Arial"/>
-          <w:sz w:val="20"/>
-          <w:szCs w:val="20"/>
-        </w:rPr>
-        <w:t xml:space="preserve">immediately. Remove any contact lenses</w:t>
-      </w:r>
-    </w:p>
-    <w:p>
-      <w:pPr>
-        <w:spacing w:after="80"/>
-      </w:pPr>
-      <w:r>
-        <w:rPr>
-          <w:rFonts w:ascii="Arial" w:cs="Arial" w:eastAsia="Arial" w:hAnsi="Arial"/>
-          <w:sz w:val="20"/>
-          <w:szCs w:val="20"/>
-        </w:rPr>
-        <w:t xml:space="preserve">In case of Ingestion:</w:t>
-      </w:r>
-    </w:p>
-    <w:p>
-      <w:pPr>
-        <w:spacing w:after="80"/>
-      </w:pPr>
-      <w:r>
-        <w:rPr>
-          <w:rFonts w:ascii="Arial" w:cs="Arial" w:eastAsia="Arial" w:hAnsi="Arial"/>
-          <w:sz w:val="20"/>
-          <w:szCs w:val="20"/>
-        </w:rPr>
-        <w:t xml:space="preserve">Do not induce vomiting, get medical attention showing the SDS and label hazardous.</w:t>
-      </w:r>
-    </w:p>
-    <w:p>
-      <w:pPr>
-        <w:spacing w:after="80"/>
-      </w:pPr>
-      <w:r>
-        <w:rPr>
-          <w:rFonts w:ascii="Arial" w:cs="Arial" w:eastAsia="Arial" w:hAnsi="Arial"/>
-          <w:sz w:val="20"/>
-          <w:szCs w:val="20"/>
-        </w:rPr>
-        <w:t xml:space="preserve">In case of Inhalation:</w:t>
-      </w:r>
-    </w:p>
-    <w:p>
-      <w:pPr>
-        <w:spacing w:after="80"/>
-      </w:pPr>
-      <w:r>
-        <w:rPr>
-          <w:rFonts w:ascii="Arial" w:cs="Arial" w:eastAsia="Arial" w:hAnsi="Arial"/>
-          <w:sz w:val="20"/>
-          <w:szCs w:val="20"/>
-        </w:rPr>
-        <w:t xml:space="preserve">In case of inhalation, consult a doctor immediately and show him packing or label. Remove casualty to fresh air and keep warm and</w:t>
-      </w:r>
-    </w:p>
-    <w:p>
-      <w:pPr>
-        <w:spacing w:after="80"/>
-      </w:pPr>
-      <w:r>
-        <w:rPr>
-          <w:rFonts w:ascii="Arial" w:cs="Arial" w:eastAsia="Arial" w:hAnsi="Arial"/>
-          <w:sz w:val="20"/>
-          <w:szCs w:val="20"/>
-        </w:rPr>
-        <w:t xml:space="preserve">at rest</w:t>
+        <w:t xml:space="preserve">4.1. Opis środków pierwszej pomocy</w:t>
+      </w:r>
+    </w:p>
+    <w:p>
+      <w:pPr>
+        <w:spacing w:after="80" w:before="80"/>
+      </w:pPr>
+      <w:r>
+        <w:rPr>
+          <w:rFonts w:ascii="Arial" w:cs="Arial" w:eastAsia="Arial" w:hAnsi="Arial"/>
+          <w:b/>
+          <w:bCs/>
+          <w:sz w:val="20"/>
+          <w:szCs w:val="20"/>
+        </w:rPr>
+        <w:t xml:space="preserve">W kontakcie ze skórą:</w:t>
+      </w:r>
+      <w:r>
+        <w:rPr>
+          <w:rFonts w:ascii="Arial" w:cs="Arial" w:eastAsia="Arial" w:hAnsi="Arial"/>
+          <w:sz w:val="20"/>
+          <w:szCs w:val="20"/>
+        </w:rPr>
+        <w:t xml:space="preserve"> Zdjąć zanieczyszczoną odzież. Narażone partie skóry zmyć dokładnie dużą ilością wody z mydłem. W przypadku wystąpienia podrażnienia skóry lub reakcji alergicznej skonsultować się z lekarzem.</w:t>
+      </w:r>
+    </w:p>
+    <w:p>
+      <w:pPr>
+        <w:spacing w:after="80" w:before="80"/>
+      </w:pPr>
+      <w:r>
+        <w:rPr>
+          <w:rFonts w:ascii="Arial" w:cs="Arial" w:eastAsia="Arial" w:hAnsi="Arial"/>
+          <w:b/>
+          <w:bCs/>
+          <w:sz w:val="20"/>
+          <w:szCs w:val="20"/>
+        </w:rPr>
+        <w:t xml:space="preserve">W kontakcie z oczami:</w:t>
+      </w:r>
+      <w:r>
+        <w:rPr>
+          <w:rFonts w:ascii="Arial" w:cs="Arial" w:eastAsia="Arial" w:hAnsi="Arial"/>
+          <w:sz w:val="20"/>
+          <w:szCs w:val="20"/>
+        </w:rPr>
+        <w:t xml:space="preserve"> Płukać obficie wodą przy szeroko otwartych powiekach przez co najmniej 10-15 minut. Chronić niepodrażnione oko, usunąć soczewki kontaktowe, jeżeli są i można je łatwo usunąć. Natychmiast skonsultować się z lekarzem okulistą.</w:t>
+      </w:r>
+    </w:p>
+    <w:p>
+      <w:pPr>
+        <w:spacing w:after="80" w:before="80"/>
+      </w:pPr>
+      <w:r>
+        <w:rPr>
+          <w:rFonts w:ascii="Arial" w:cs="Arial" w:eastAsia="Arial" w:hAnsi="Arial"/>
+          <w:b/>
+          <w:bCs/>
+          <w:sz w:val="20"/>
+          <w:szCs w:val="20"/>
+        </w:rPr>
+        <w:t xml:space="preserve">W przypadku spożycia:</w:t>
+      </w:r>
+      <w:r>
+        <w:rPr>
+          <w:rFonts w:ascii="Arial" w:cs="Arial" w:eastAsia="Arial" w:hAnsi="Arial"/>
+          <w:sz w:val="20"/>
+          <w:szCs w:val="20"/>
+        </w:rPr>
+        <w:t xml:space="preserve"> Nie wywoływać wymiotów bez konsultacji lekarskiej. Wypłukać usta wodą. Nigdy nie podawać niczego do ust osobie nieprzytomnej. Natychmiast zasięgnąć porady lekarza, pokazując kartę charakterystyki lub etykietę produktu.</w:t>
+      </w:r>
+    </w:p>
+    <w:p>
+      <w:pPr>
+        <w:spacing w:after="80" w:before="80"/>
+      </w:pPr>
+      <w:r>
+        <w:rPr>
+          <w:rFonts w:ascii="Arial" w:cs="Arial" w:eastAsia="Arial" w:hAnsi="Arial"/>
+          <w:b/>
+          <w:bCs/>
+          <w:sz w:val="20"/>
+          <w:szCs w:val="20"/>
+        </w:rPr>
+        <w:t xml:space="preserve">Po narażeniu drogą oddechową:</w:t>
+      </w:r>
+      <w:r>
+        <w:rPr>
+          <w:rFonts w:ascii="Arial" w:cs="Arial" w:eastAsia="Arial" w:hAnsi="Arial"/>
+          <w:sz w:val="20"/>
+          <w:szCs w:val="20"/>
+        </w:rPr>
+        <w:t xml:space="preserve"> Wyprowadzić poszkodowanego na świeże powietrze, zapewnić ciepło i spokój w pozycji półsiedzącej. W przypadku wystąpienia niepokojących objawów lub złego samopoczucia skonsultować się z lekarzem i pokazać opakowanie lub etykietę.</w:t>
       </w:r>
     </w:p>
     <w:p>
@@ -1439,20 +1348,20 @@
           <w:sz w:val="20"/>
           <w:szCs w:val="20"/>
         </w:rPr>
-        <w:t xml:space="preserve">4.2. Most important symptoms and effects, both acute and delayed</w:t>
-      </w:r>
-    </w:p>
-    <w:p>
-      <w:pPr>
-        <w:spacing w:after="80"/>
-      </w:pPr>
-      <w:r>
-        <w:rPr>
-          <w:rFonts w:ascii="Arial" w:cs="Arial" w:eastAsia="Arial" w:hAnsi="Arial"/>
-          <w:sz w:val="20"/>
-          <w:szCs w:val="20"/>
-        </w:rPr>
-        <w:t xml:space="preserve">No specific information is available on the symptoms and effects caused by the product.</w:t>
+        <w:t xml:space="preserve">4.2. Najważniejsze ostre i opóźnione objawy oraz skutki narażenia</w:t>
+      </w:r>
+    </w:p>
+    <w:p>
+      <w:pPr>
+        <w:spacing w:after="80"/>
+      </w:pPr>
+      <w:r>
+        <w:rPr>
+          <w:rFonts w:ascii="Arial" w:cs="Arial" w:eastAsia="Arial" w:hAnsi="Arial"/>
+          <w:sz w:val="20"/>
+          <w:szCs w:val="20"/>
+        </w:rPr>
+        <w:t xml:space="preserve">Brak dostępnych szczegółowych informacji na temat specyficznych objawów i skutków wywoływanych przez produkt. W kontakcie ze skórą może wywoływać reakcję alergiczną u osób podatnych (zawiera substancje uczulające wymienione w sekcji 2.2).</w:t>
       </w:r>
     </w:p>
     <w:p>
@@ -1467,20 +1376,30 @@
           <w:sz w:val="20"/>
           <w:szCs w:val="20"/>
         </w:rPr>
-        <w:t xml:space="preserve">4.3. Indication of any immediate medical attention and special treatment needed</w:t>
-      </w:r>
-    </w:p>
-    <w:p>
-      <w:pPr>
-        <w:spacing w:after="80"/>
-      </w:pPr>
-      <w:r>
-        <w:rPr>
-          <w:rFonts w:ascii="Arial" w:cs="Arial" w:eastAsia="Arial" w:hAnsi="Arial"/>
-          <w:sz w:val="20"/>
-          <w:szCs w:val="20"/>
-        </w:rPr>
-        <w:t xml:space="preserve">Treatment:Data not available.</w:t>
+        <w:t xml:space="preserve">4.3. Wskazania dotyczące wszelkiej natychmiastowej pomocy lekarskiej i szczególnego postępowania z poszkodowanym</w:t>
+      </w:r>
+    </w:p>
+    <w:p>
+      <w:pPr>
+        <w:spacing w:after="80" w:before="80"/>
+      </w:pPr>
+      <w:r>
+        <w:rPr>
+          <w:rFonts w:ascii="Arial" w:cs="Arial" w:eastAsia="Arial" w:hAnsi="Arial"/>
+          <w:b/>
+          <w:bCs/>
+          <w:sz w:val="20"/>
+          <w:szCs w:val="20"/>
+        </w:rPr>
+        <w:t xml:space="preserve">Leczenie:</w:t>
+      </w:r>
+      <w:r>
+        <w:rPr>
+          <w:rFonts w:ascii="Arial" w:cs="Arial" w:eastAsia="Arial" w:hAnsi="Arial"/>
+          <w:sz w:val="20"/>
+          <w:szCs w:val="20"/>
+        </w:rPr>
+        <w:t xml:space="preserve"> Leczenie objawowe. Brak dostępnych szczegółowych danych dotyczących specyficznego leczenia lub antidotum. Decyzję o sposobie postępowania ratunkowego podejmuje lekarz po dokładnej ocenie stanu poszkodowanego.</w:t>
       </w:r>
     </w:p>
     <w:p>

</xml_diff>

<commit_message>
feat(sds): overhaul section 5 firefighting measures per EU 2020/878 and EKOS pattern (ADR-044)
</commit_message>
<xml_diff>
--- a/docs/SDS/Karta_Charakterystyki_8051944811087_SDS_NAJMA.docx
+++ b/docs/SDS/Karta_Charakterystyki_8051944811087_SDS_NAJMA.docx
@@ -1407,7 +1407,6 @@
         <w:pBdr>
           <w:bottom w:color="00A651" w:sz="12" w:space="1"/>
         </w:pBdr>
-        <w:shd w:fill="FFF9E6" w:val="clear"/>
         <w:spacing w:after="150" w:before="300"/>
       </w:pPr>
       <w:r>
@@ -1422,58 +1421,6 @@
     </w:p>
     <w:p>
       <w:pPr>
-        <w:spacing w:after="80"/>
-      </w:pPr>
-      <w:r>
-        <w:rPr>
-          <w:rFonts w:ascii="Arial" w:cs="Arial" w:eastAsia="Arial" w:hAnsi="Arial"/>
-          <w:sz w:val="20"/>
-          <w:szCs w:val="20"/>
-        </w:rPr>
-        <w:t xml:space="preserve">[FLAGA_QUARANTINE_REVIEW] Sekcja zablokowana przez system (Ryzyko Niewłaściwego Środka Gaśniczego).</w:t>
-      </w:r>
-    </w:p>
-    <w:p>
-      <w:pPr>
-        <w:spacing w:after="80"/>
-      </w:pPr>
-      <w:r>
-        <w:rPr>
-          <w:rFonts w:ascii="Arial" w:cs="Arial" w:eastAsia="Arial" w:hAnsi="Arial"/>
-          <w:sz w:val="20"/>
-          <w:szCs w:val="20"/>
-        </w:rPr>
-        <w:t xml:space="preserve">Wymagana weryfikacja procedur gaśniczych.</w:t>
-      </w:r>
-    </w:p>
-    <w:p>
-      <w:pPr>
-        <w:spacing w:after="80"/>
-      </w:pPr>
-      <w:r>
-        <w:rPr>
-          <w:rFonts w:ascii="Arial" w:cs="Arial" w:eastAsia="Arial" w:hAnsi="Arial"/>
-          <w:sz w:val="20"/>
-          <w:szCs w:val="20"/>
-        </w:rPr>
-        <w:t xml:space="preserve">ORYGINAŁ DO WERYFIKACJI:</w:t>
-      </w:r>
-    </w:p>
-    <w:p>
-      <w:pPr>
-        <w:spacing w:after="80"/>
-      </w:pPr>
-      <w:r>
-        <w:rPr>
-          <w:rFonts w:ascii="Arial" w:cs="Arial" w:eastAsia="Arial" w:hAnsi="Arial"/>
-          <w:sz w:val="20"/>
-          <w:szCs w:val="20"/>
-        </w:rPr>
-        <w:t xml:space="preserve">SECTION 5: Firefighting measures</w:t>
-      </w:r>
-    </w:p>
-    <w:p>
-      <w:pPr>
         <w:spacing w:after="100" w:before="200"/>
       </w:pPr>
       <w:r>
@@ -1484,59 +1431,53 @@
           <w:sz w:val="20"/>
           <w:szCs w:val="20"/>
         </w:rPr>
-        <w:t xml:space="preserve">5.1. Extinguishing media</w:t>
-      </w:r>
-    </w:p>
-    <w:p>
-      <w:pPr>
-        <w:spacing w:after="80"/>
-      </w:pPr>
-      <w:r>
-        <w:rPr>
-          <w:rFonts w:ascii="Arial" w:cs="Arial" w:eastAsia="Arial" w:hAnsi="Arial"/>
-          <w:sz w:val="20"/>
-          <w:szCs w:val="20"/>
-        </w:rPr>
-        <w:t xml:space="preserve">Suitable extinguishing media:</w:t>
-      </w:r>
-    </w:p>
-    <w:p>
-      <w:pPr>
-        <w:spacing w:after="80"/>
-      </w:pPr>
-      <w:r>
-        <w:rPr>
-          <w:rFonts w:ascii="Arial" w:cs="Arial" w:eastAsia="Arial" w:hAnsi="Arial"/>
-          <w:sz w:val="20"/>
-          <w:szCs w:val="20"/>
-        </w:rPr>
-        <w:t xml:space="preserve">CO2 or Dry chemical fire extinguisher. foam; Water</w:t>
-      </w:r>
-    </w:p>
-    <w:p>
-      <w:pPr>
-        <w:spacing w:after="80"/>
-      </w:pPr>
-      <w:r>
-        <w:rPr>
-          <w:rFonts w:ascii="Arial" w:cs="Arial" w:eastAsia="Arial" w:hAnsi="Arial"/>
-          <w:sz w:val="20"/>
-          <w:szCs w:val="20"/>
-        </w:rPr>
-        <w:t xml:space="preserve">Extinguishing media which must not be used for safety reasons:</w:t>
-      </w:r>
-    </w:p>
-    <w:p>
-      <w:pPr>
-        <w:spacing w:after="80"/>
-      </w:pPr>
-      <w:r>
-        <w:rPr>
-          <w:rFonts w:ascii="Arial" w:cs="Arial" w:eastAsia="Arial" w:hAnsi="Arial"/>
-          <w:sz w:val="20"/>
-          <w:szCs w:val="20"/>
-        </w:rPr>
-        <w:t xml:space="preserve">None in particular.</w:t>
+        <w:t xml:space="preserve">5.1. Środki gaśnicze</w:t>
+      </w:r>
+    </w:p>
+    <w:p>
+      <w:pPr>
+        <w:spacing w:after="80" w:before="80"/>
+      </w:pPr>
+      <w:r>
+        <w:rPr>
+          <w:rFonts w:ascii="Arial" w:cs="Arial" w:eastAsia="Arial" w:hAnsi="Arial"/>
+          <w:b/>
+          <w:bCs/>
+          <w:sz w:val="20"/>
+          <w:szCs w:val="20"/>
+        </w:rPr>
+        <w:t xml:space="preserve">Odpowiednie środki gaśnicze:</w:t>
+      </w:r>
+      <w:r>
+        <w:rPr>
+          <w:rFonts w:ascii="Arial" w:cs="Arial" w:eastAsia="Arial" w:hAnsi="Arial"/>
+          <w:sz w:val="20"/>
+          <w:szCs w:val="20"/>
+        </w:rPr>
+        <w:t xml:space="preserve"> Piana gaśnicza, proszek gaśniczy, gaśnica śniegowa (CO2), rozproszony strumień wody (mgła wodna).</w:t>
+      </w:r>
+    </w:p>
+    <w:p>
+      <w:pPr>
+        <w:spacing w:after="80" w:before="80"/>
+      </w:pPr>
+      <w:r>
+        <w:rPr>
+          <w:rFonts w:ascii="Arial" w:cs="Arial" w:eastAsia="Arial" w:hAnsi="Arial"/>
+          <w:b/>
+          <w:bCs/>
+          <w:sz w:val="20"/>
+          <w:szCs w:val="20"/>
+        </w:rPr>
+        <w:t xml:space="preserve">Niewłaściwe środki gaśnicze:</w:t>
+      </w:r>
+      <w:r>
+        <w:rPr>
+          <w:rFonts w:ascii="Arial" w:cs="Arial" w:eastAsia="Arial" w:hAnsi="Arial"/>
+          <w:sz w:val="20"/>
+          <w:szCs w:val="20"/>
+        </w:rPr>
+        <w:t xml:space="preserve"> Brak szczególnych ograniczeń. Nie zaleca się stosowania zwartego strumienia wody ze względu na ryzyko rozprzestrzenienia pożaru.</w:t>
       </w:r>
     </w:p>
     <w:p>
@@ -1551,20 +1492,20 @@
           <w:sz w:val="20"/>
           <w:szCs w:val="20"/>
         </w:rPr>
-        <w:t xml:space="preserve">5.2. Special hazards arising from the substance or mixture</w:t>
-      </w:r>
-    </w:p>
-    <w:p>
-      <w:pPr>
-        <w:spacing w:after="80"/>
-      </w:pPr>
-      <w:r>
-        <w:rPr>
-          <w:rFonts w:ascii="Arial" w:cs="Arial" w:eastAsia="Arial" w:hAnsi="Arial"/>
-          <w:sz w:val="20"/>
-          <w:szCs w:val="20"/>
-        </w:rPr>
-        <w:t xml:space="preserve">Avoid breathing combustion products.</w:t>
+        <w:t xml:space="preserve">5.2. Szczególne zagrożenia związane z substancją lub mieszaniną</w:t>
+      </w:r>
+    </w:p>
+    <w:p>
+      <w:pPr>
+        <w:spacing w:after="80"/>
+      </w:pPr>
+      <w:r>
+        <w:rPr>
+          <w:rFonts w:ascii="Arial" w:cs="Arial" w:eastAsia="Arial" w:hAnsi="Arial"/>
+          <w:sz w:val="20"/>
+          <w:szCs w:val="20"/>
+        </w:rPr>
+        <w:t xml:space="preserve">Unikać wdychania produktów spalania. Podczas pożaru mogą wydzielać się toksyczne gazy, dymy i tlenki węgla.</w:t>
       </w:r>
     </w:p>
     <w:p>
@@ -1579,33 +1520,30 @@
           <w:sz w:val="20"/>
           <w:szCs w:val="20"/>
         </w:rPr>
-        <w:t xml:space="preserve">5.3. Advice for firefighters</w:t>
-      </w:r>
-    </w:p>
-    <w:p>
-      <w:pPr>
-        <w:spacing w:after="80"/>
-      </w:pPr>
-      <w:r>
-        <w:rPr>
-          <w:rFonts w:ascii="Arial" w:cs="Arial" w:eastAsia="Arial" w:hAnsi="Arial"/>
-          <w:sz w:val="20"/>
-          <w:szCs w:val="20"/>
-        </w:rPr>
-        <w:t xml:space="preserve">Collect contaminated fire extinguishing water separately. This must not be discharged into drains. Use fire fighter's clothing</w:t>
-      </w:r>
-    </w:p>
-    <w:p>
-      <w:pPr>
-        <w:spacing w:after="80"/>
-      </w:pPr>
-      <w:r>
-        <w:rPr>
-          <w:rFonts w:ascii="Arial" w:cs="Arial" w:eastAsia="Arial" w:hAnsi="Arial"/>
-          <w:sz w:val="20"/>
-          <w:szCs w:val="20"/>
-        </w:rPr>
-        <w:t xml:space="preserve">conforming to European standard EN469. Use Self-Contained Breathing Apparatus (SCBA) with chemical resistant gloves</w:t>
+        <w:t xml:space="preserve">5.3. Informacje dla straży pożarnej</w:t>
+      </w:r>
+    </w:p>
+    <w:p>
+      <w:pPr>
+        <w:spacing w:after="80" w:before="80"/>
+      </w:pPr>
+      <w:r>
+        <w:rPr>
+          <w:rFonts w:ascii="Arial" w:cs="Arial" w:eastAsia="Arial" w:hAnsi="Arial"/>
+          <w:b/>
+          <w:bCs/>
+          <w:sz w:val="20"/>
+          <w:szCs w:val="20"/>
+        </w:rPr>
+        <w:t xml:space="preserve">Środki ochrony strażaków:</w:t>
+      </w:r>
+      <w:r>
+        <w:rPr>
+          <w:rFonts w:ascii="Arial" w:cs="Arial" w:eastAsia="Arial" w:hAnsi="Arial"/>
+          <w:sz w:val="20"/>
+          <w:szCs w:val="20"/>
+        </w:rPr>
+        <w:t xml:space="preserve"> Gromadzić oddzielnie zanieczyszczoną wodę gaśniczą; nie dopuścić do jej przedostania się do kanalizacji i wód gruntowych. Stosować odzież ochronną dla strażaków zgodną z normą europejską EN 469. Stosować autonomiczny aparat oddechowy (SCBA) z rękawicami chemoodpornymi.</w:t>
       </w:r>
     </w:p>
     <w:p>

</xml_diff>

<commit_message>
feat(sds): overhaul section 6 accidental release measures per EU 2020/878 and EKOS pattern (ADR-045)
</commit_message>
<xml_diff>
--- a/docs/SDS/Karta_Charakterystyki_8051944811087_SDS_NAJMA.docx
+++ b/docs/SDS/Karta_Charakterystyki_8051944811087_SDS_NAJMA.docx
@@ -1575,7 +1575,137 @@
           <w:sz w:val="20"/>
           <w:szCs w:val="20"/>
         </w:rPr>
-        <w:t xml:space="preserve">6.1. Indywidualne środki ostrożności: Zapewnić odpowiednią wentylację.</w:t>
+        <w:t xml:space="preserve">6.1. Indywidualne środki ostrożności, wyposażenie ochronne i procedury w sytuacjach awaryjnych</w:t>
+      </w:r>
+    </w:p>
+    <w:p>
+      <w:pPr>
+        <w:spacing w:after="80" w:before="80"/>
+      </w:pPr>
+      <w:r>
+        <w:rPr>
+          <w:rFonts w:ascii="Arial" w:cs="Arial" w:eastAsia="Arial" w:hAnsi="Arial"/>
+          <w:b/>
+          <w:bCs/>
+          <w:sz w:val="20"/>
+          <w:szCs w:val="20"/>
+        </w:rPr>
+        <w:t xml:space="preserve">Dla osób nienależących do personelu udzielającego pomocy:</w:t>
+      </w:r>
+      <w:r>
+        <w:rPr>
+          <w:rFonts w:ascii="Arial" w:cs="Arial" w:eastAsia="Arial" w:hAnsi="Arial"/>
+          <w:sz w:val="20"/>
+          <w:szCs w:val="20"/>
+        </w:rPr>
+        <w:t xml:space="preserve"> Ewakuować osoby niepowołane z obszaru zagrożenia. Unikać zanieczyszczenia skóry i oczu. Zapewnić odpowiednią wentylację pomieszczeń.</w:t>
+      </w:r>
+    </w:p>
+    <w:p>
+      <w:pPr>
+        <w:spacing w:after="80" w:before="80"/>
+      </w:pPr>
+      <w:r>
+        <w:rPr>
+          <w:rFonts w:ascii="Arial" w:cs="Arial" w:eastAsia="Arial" w:hAnsi="Arial"/>
+          <w:b/>
+          <w:bCs/>
+          <w:sz w:val="20"/>
+          <w:szCs w:val="20"/>
+        </w:rPr>
+        <w:t xml:space="preserve">Dla osób udzielających pomocy:</w:t>
+      </w:r>
+      <w:r>
+        <w:rPr>
+          <w:rFonts w:ascii="Arial" w:cs="Arial" w:eastAsia="Arial" w:hAnsi="Arial"/>
+          <w:sz w:val="20"/>
+          <w:szCs w:val="20"/>
+        </w:rPr>
+        <w:t xml:space="preserve"> Stosować kompletne wyposażenie ochronne (patrz sekcja 8). Unikać wdychania oparów/aerozoli.</w:t>
+      </w:r>
+    </w:p>
+    <w:p>
+      <w:pPr>
+        <w:spacing w:after="100" w:before="200"/>
+      </w:pPr>
+      <w:r>
+        <w:rPr>
+          <w:rFonts w:ascii="Arial" w:cs="Arial" w:eastAsia="Arial" w:hAnsi="Arial"/>
+          <w:b/>
+          <w:bCs/>
+          <w:sz w:val="20"/>
+          <w:szCs w:val="20"/>
+        </w:rPr>
+        <w:t xml:space="preserve">6.2. Środki ostrożności w zakresie ochrony środowiska</w:t>
+      </w:r>
+    </w:p>
+    <w:p>
+      <w:pPr>
+        <w:spacing w:after="80"/>
+      </w:pPr>
+      <w:r>
+        <w:rPr>
+          <w:rFonts w:ascii="Arial" w:cs="Arial" w:eastAsia="Arial" w:hAnsi="Arial"/>
+          <w:sz w:val="20"/>
+          <w:szCs w:val="20"/>
+        </w:rPr>
+        <w:t xml:space="preserve">Nie dopuścić do przedostania się produktu do gleby, wód gruntowych, wód powierzchniowych ani do kanalizacji. Zatrzymać zanieczyszczoną wodę z mycia i przekazać do bezpiecznej utylizacji. W przypadku skażenia wód lub przedostania się do kanalizacji niezwłocznie powiadomić właściwe władze i służby ratownicze.</w:t>
+      </w:r>
+    </w:p>
+    <w:p>
+      <w:pPr>
+        <w:spacing w:after="100" w:before="200"/>
+      </w:pPr>
+      <w:r>
+        <w:rPr>
+          <w:rFonts w:ascii="Arial" w:cs="Arial" w:eastAsia="Arial" w:hAnsi="Arial"/>
+          <w:b/>
+          <w:bCs/>
+          <w:sz w:val="20"/>
+          <w:szCs w:val="20"/>
+        </w:rPr>
+        <w:t xml:space="preserve">6.3. Metody i materiały zapobiegające rozprzestrzenianiu się skażenia i służące do usuwania skażenia</w:t>
+      </w:r>
+    </w:p>
+    <w:p>
+      <w:pPr>
+        <w:spacing w:after="80"/>
+      </w:pPr>
+      <w:r>
+        <w:rPr>
+          <w:rFonts w:ascii="Arial" w:cs="Arial" w:eastAsia="Arial" w:hAnsi="Arial"/>
+          <w:sz w:val="20"/>
+          <w:szCs w:val="20"/>
+        </w:rPr>
+        <w:t xml:space="preserve">Zatamować wyciek, o ile jest to bezpieczne. Ograniczyć rozprzestrzenianie i zebrać za pomocą niepalnego materiału absorbującego ciecze (piasek, ziemia okrzemkowa, uniwersalny środek wiążący, trociny) do oznakowanych pojemników na odpady. Zanieczyszczoną powierzchnię zmyć dużą ilością wody.</w:t>
+      </w:r>
+    </w:p>
+    <w:p>
+      <w:pPr>
+        <w:spacing w:after="100" w:before="200"/>
+      </w:pPr>
+      <w:r>
+        <w:rPr>
+          <w:rFonts w:ascii="Arial" w:cs="Arial" w:eastAsia="Arial" w:hAnsi="Arial"/>
+          <w:b/>
+          <w:bCs/>
+          <w:sz w:val="20"/>
+          <w:szCs w:val="20"/>
+        </w:rPr>
+        <w:t xml:space="preserve">6.4. Odniesienia do innych sekcji</w:t>
+      </w:r>
+    </w:p>
+    <w:p>
+      <w:pPr>
+        <w:spacing w:after="80"/>
+      </w:pPr>
+      <w:r>
+        <w:rPr>
+          <w:rFonts w:ascii="Arial" w:cs="Arial" w:eastAsia="Arial" w:hAnsi="Arial"/>
+          <w:sz w:val="20"/>
+          <w:szCs w:val="20"/>
+        </w:rPr>
+        <w:t xml:space="preserve">Informacje dotyczące odpowiedniego sprzętu ochrony indywidualnej podano w sekcji 8. Informacje dotyczące bezpiecznego postępowania z substancją podano w sekcji 7. Informacje dotyczące unieszkodliwiania odpadów podano w sekcji 13.</w:t>
       </w:r>
     </w:p>
     <w:p>

</xml_diff>

<commit_message>
feat(sds): overhaul section 7 handling and storage per EU 2020/878 and EKOS pattern (ADR-046)
</commit_message>
<xml_diff>
--- a/docs/SDS/Karta_Charakterystyki_8051944811087_SDS_NAJMA.docx
+++ b/docs/SDS/Karta_Charakterystyki_8051944811087_SDS_NAJMA.docx
@@ -1737,7 +1737,244 @@
           <w:sz w:val="20"/>
           <w:szCs w:val="20"/>
         </w:rPr>
-        <w:t xml:space="preserve">7.1. Środki ostrożności: Unikać kontaktu ze skórą i oczami.</w:t>
+        <w:t xml:space="preserve">7.1. Środki ostrożności dotyczące bezpiecznego postępowania</w:t>
+      </w:r>
+    </w:p>
+    <w:p>
+      <w:pPr>
+        <w:spacing w:after="80" w:before="80"/>
+      </w:pPr>
+      <w:r>
+        <w:rPr>
+          <w:rFonts w:ascii="Arial" w:cs="Arial" w:eastAsia="Arial" w:hAnsi="Arial"/>
+          <w:b/>
+          <w:bCs/>
+          <w:sz w:val="20"/>
+          <w:szCs w:val="20"/>
+        </w:rPr>
+        <w:t xml:space="preserve">Środki ostrożności:</w:t>
+      </w:r>
+      <w:r>
+        <w:rPr>
+          <w:rFonts w:ascii="Arial" w:cs="Arial" w:eastAsia="Arial" w:hAnsi="Arial"/>
+          <w:sz w:val="20"/>
+          <w:szCs w:val="20"/>
+        </w:rPr>
+        <w:t xml:space="preserve"> Unikać kontaktu ze skórą i oczami. Unikać wdychania par, mgieł oraz rozpylonej cieczy. Zapewnić odpowiednią wentylację w miejscu pracy. Nie wdychać rozpylanego aerozolu.</w:t>
+      </w:r>
+    </w:p>
+    <w:p>
+      <w:pPr>
+        <w:spacing w:after="80" w:before="80"/>
+      </w:pPr>
+      <w:r>
+        <w:rPr>
+          <w:rFonts w:ascii="Arial" w:cs="Arial" w:eastAsia="Arial" w:hAnsi="Arial"/>
+          <w:b/>
+          <w:bCs/>
+          <w:sz w:val="20"/>
+          <w:szCs w:val="20"/>
+        </w:rPr>
+        <w:t xml:space="preserve">Zalecenia dotyczące ogólnej higieny pracy:</w:t>
+      </w:r>
+      <w:r>
+        <w:rPr>
+          <w:rFonts w:ascii="Arial" w:cs="Arial" w:eastAsia="Arial" w:hAnsi="Arial"/>
+          <w:sz w:val="20"/>
+          <w:szCs w:val="20"/>
+        </w:rPr>
+        <w:t xml:space="preserve"> Nie jeść, nie pić i nie palić tytoniu podczas stosowania produktu. Dokładnie umyć ręce wodą z mydłem po użyciu oraz przed posiłkami. Zdjąć zanieczyszczoną odzież i sprzęt ochronny przed wejściem do miejsc przeznaczonych do spożywania posiłków. Wyprać zanieczyszczoną odzież przed ponownym użyciem.</w:t>
+      </w:r>
+    </w:p>
+    <w:p>
+      <w:pPr>
+        <w:spacing w:after="80" w:before="80"/>
+      </w:pPr>
+      <w:r>
+        <w:rPr>
+          <w:rFonts w:ascii="Arial" w:cs="Arial" w:eastAsia="Arial" w:hAnsi="Arial"/>
+          <w:b/>
+          <w:bCs/>
+          <w:sz w:val="20"/>
+          <w:szCs w:val="20"/>
+        </w:rPr>
+        <w:t xml:space="preserve">Zalecany sprzęt ochrony osobistej:</w:t>
+      </w:r>
+      <w:r>
+        <w:rPr>
+          <w:rFonts w:ascii="Arial" w:cs="Arial" w:eastAsia="Arial" w:hAnsi="Arial"/>
+          <w:sz w:val="20"/>
+          <w:szCs w:val="20"/>
+        </w:rPr>
+        <w:t xml:space="preserve"> patrz sekcja 8.</w:t>
+      </w:r>
+    </w:p>
+    <w:p>
+      <w:pPr>
+        <w:spacing w:after="100" w:before="200"/>
+      </w:pPr>
+      <w:r>
+        <w:rPr>
+          <w:rFonts w:ascii="Arial" w:cs="Arial" w:eastAsia="Arial" w:hAnsi="Arial"/>
+          <w:b/>
+          <w:bCs/>
+          <w:sz w:val="20"/>
+          <w:szCs w:val="20"/>
+        </w:rPr>
+        <w:t xml:space="preserve">7.2. Warunki bezpiecznego magazynowania, w tym informacje dotyczące wszelkich wzajemnych niezgodności</w:t>
+      </w:r>
+    </w:p>
+    <w:p>
+      <w:pPr>
+        <w:spacing w:after="80" w:before="80"/>
+      </w:pPr>
+      <w:r>
+        <w:rPr>
+          <w:rFonts w:ascii="Arial" w:cs="Arial" w:eastAsia="Arial" w:hAnsi="Arial"/>
+          <w:b/>
+          <w:bCs/>
+          <w:sz w:val="20"/>
+          <w:szCs w:val="20"/>
+        </w:rPr>
+        <w:t xml:space="preserve">Warunki magazynowania:</w:t>
+      </w:r>
+      <w:r>
+        <w:rPr>
+          <w:rFonts w:ascii="Arial" w:cs="Arial" w:eastAsia="Arial" w:hAnsi="Arial"/>
+          <w:sz w:val="20"/>
+          <w:szCs w:val="20"/>
+        </w:rPr>
+        <w:t xml:space="preserve"> Przechowywać w oryginalnych, prawidłowo oznakowanych i szczelnie zamkniętych opakowaniach, w suchym, chłodnym i dobrze wentylowanym miejscu. Chronić przed bezpośrednim nasłonecznieniem, wilgocią, przemrożeniem i źródłami ciepła.</w:t>
+      </w:r>
+    </w:p>
+    <w:p>
+      <w:pPr>
+        <w:spacing w:after="80" w:before="80"/>
+      </w:pPr>
+      <w:r>
+        <w:rPr>
+          <w:rFonts w:ascii="Arial" w:cs="Arial" w:eastAsia="Arial" w:hAnsi="Arial"/>
+          <w:b/>
+          <w:bCs/>
+          <w:sz w:val="20"/>
+          <w:szCs w:val="20"/>
+        </w:rPr>
+        <w:t xml:space="preserve">Zalecana temperatura magazynowania:</w:t>
+      </w:r>
+      <w:r>
+        <w:rPr>
+          <w:rFonts w:ascii="Arial" w:cs="Arial" w:eastAsia="Arial" w:hAnsi="Arial"/>
+          <w:sz w:val="20"/>
+          <w:szCs w:val="20"/>
+        </w:rPr>
+        <w:t xml:space="preserve"> od 5°C do 30°C. Przechowywać w miejscu niedostępnym dla dzieci i osób nieupoważnionych.</w:t>
+      </w:r>
+    </w:p>
+    <w:p>
+      <w:pPr>
+        <w:spacing w:after="80" w:before="80"/>
+      </w:pPr>
+      <w:r>
+        <w:rPr>
+          <w:rFonts w:ascii="Arial" w:cs="Arial" w:eastAsia="Arial" w:hAnsi="Arial"/>
+          <w:b/>
+          <w:bCs/>
+          <w:sz w:val="20"/>
+          <w:szCs w:val="20"/>
+        </w:rPr>
+        <w:t xml:space="preserve">Materiały niezgodne:</w:t>
+      </w:r>
+      <w:r>
+        <w:rPr>
+          <w:rFonts w:ascii="Arial" w:cs="Arial" w:eastAsia="Arial" w:hAnsi="Arial"/>
+          <w:sz w:val="20"/>
+          <w:szCs w:val="20"/>
+        </w:rPr>
+        <w:t xml:space="preserve"> Brak szczególnych przy prawidłowym użytkowaniu i magazynowaniu. Nie przechowywać razem z silnymi utleniaczami, mocnymi kwasami, zasadami oraz żywnością, napojami i paszami dla zwierząt.</w:t>
+      </w:r>
+    </w:p>
+    <w:p>
+      <w:pPr>
+        <w:spacing w:after="80" w:before="80"/>
+      </w:pPr>
+      <w:r>
+        <w:rPr>
+          <w:rFonts w:ascii="Arial" w:cs="Arial" w:eastAsia="Arial" w:hAnsi="Arial"/>
+          <w:b/>
+          <w:bCs/>
+          <w:sz w:val="20"/>
+          <w:szCs w:val="20"/>
+        </w:rPr>
+        <w:t xml:space="preserve">Wskazówki dotyczące pomieszczeń magazynowych:</w:t>
+      </w:r>
+      <w:r>
+        <w:rPr>
+          <w:rFonts w:ascii="Arial" w:cs="Arial" w:eastAsia="Arial" w:hAnsi="Arial"/>
+          <w:sz w:val="20"/>
+          <w:szCs w:val="20"/>
+        </w:rPr>
+        <w:t xml:space="preserve"> Pomieszczenia magazynowe powinny być odpowiednio wentylowane, suche, o nienasiąkliwej i odpornej chemicznie posadzce uniemożliwiającej przenikanie cieczy do gruntu i kanalizacji.</w:t>
+      </w:r>
+    </w:p>
+    <w:p>
+      <w:pPr>
+        <w:spacing w:after="100" w:before="200"/>
+      </w:pPr>
+      <w:r>
+        <w:rPr>
+          <w:rFonts w:ascii="Arial" w:cs="Arial" w:eastAsia="Arial" w:hAnsi="Arial"/>
+          <w:b/>
+          <w:bCs/>
+          <w:sz w:val="20"/>
+          <w:szCs w:val="20"/>
+        </w:rPr>
+        <w:t xml:space="preserve">7.3. Szczególne zastosowanie(-a) końcowe</w:t>
+      </w:r>
+    </w:p>
+    <w:p>
+      <w:pPr>
+        <w:spacing w:after="80" w:before="80"/>
+      </w:pPr>
+      <w:r>
+        <w:rPr>
+          <w:rFonts w:ascii="Arial" w:cs="Arial" w:eastAsia="Arial" w:hAnsi="Arial"/>
+          <w:b/>
+          <w:bCs/>
+          <w:sz w:val="20"/>
+          <w:szCs w:val="20"/>
+        </w:rPr>
+        <w:t xml:space="preserve">Zastosowanie:</w:t>
+      </w:r>
+      <w:r>
+        <w:rPr>
+          <w:rFonts w:ascii="Arial" w:cs="Arial" w:eastAsia="Arial" w:hAnsi="Arial"/>
+          <w:sz w:val="20"/>
+          <w:szCs w:val="20"/>
+        </w:rPr>
+        <w:t xml:space="preserve"> Mieszanina zapachowa / perfumy do tkanin i wnętrz (odświeżacz powietrza). Brak innych szczególnych zastosowań poza wymienionymi w podsekcji 1.2. Stosować ściśle według zaleceń producenta i instrukcji na etykiecie.</w:t>
+      </w:r>
+    </w:p>
+    <w:p>
+      <w:pPr>
+        <w:spacing w:after="80" w:before="80"/>
+      </w:pPr>
+      <w:r>
+        <w:rPr>
+          <w:rFonts w:ascii="Arial" w:cs="Arial" w:eastAsia="Arial" w:hAnsi="Arial"/>
+          <w:b/>
+          <w:bCs/>
+          <w:sz w:val="20"/>
+          <w:szCs w:val="20"/>
+        </w:rPr>
+        <w:t xml:space="preserve">Rozwiązania specyficzne dla sektora przemysłowego:</w:t>
+      </w:r>
+      <w:r>
+        <w:rPr>
+          <w:rFonts w:ascii="Arial" w:cs="Arial" w:eastAsia="Arial" w:hAnsi="Arial"/>
+          <w:sz w:val="20"/>
+          <w:szCs w:val="20"/>
+        </w:rPr>
+        <w:t xml:space="preserve"> Brak szczególnych wytycznych.</w:t>
       </w:r>
     </w:p>
     <w:p>
@@ -1808,33 +2045,33 @@
           <w:sz w:val="20"/>
           <w:szCs w:val="20"/>
         </w:rPr>
-        <w:t xml:space="preserve">- [CAS: 32210-23-4]: NDS: ______ | NDSCh: ______</w:t>
-      </w:r>
-    </w:p>
-    <w:p>
-      <w:pPr>
-        <w:spacing w:after="80"/>
-      </w:pPr>
-      <w:r>
-        <w:rPr>
-          <w:rFonts w:ascii="Arial" w:cs="Arial" w:eastAsia="Arial" w:hAnsi="Arial"/>
-          <w:sz w:val="20"/>
-          <w:szCs w:val="20"/>
-        </w:rPr>
-        <w:t xml:space="preserve">- [CAS: 104-55-2]: NDS: ______ | NDSCh: ______</w:t>
-      </w:r>
-    </w:p>
-    <w:p>
-      <w:pPr>
-        <w:spacing w:after="80"/>
-      </w:pPr>
-      <w:r>
-        <w:rPr>
-          <w:rFonts w:ascii="Arial" w:cs="Arial" w:eastAsia="Arial" w:hAnsi="Arial"/>
-          <w:sz w:val="20"/>
-          <w:szCs w:val="20"/>
-        </w:rPr>
-        <w:t xml:space="preserve">- [CAS: 55965-84-9]: NDS: ______ | NDSCh: ______</w:t>
+        <w:t xml:space="preserve">CAS 32210-23-4: Brak określonych krajowych wartości najwyższych dopuszczalnych stężeń (NDS, NDSCh, NDSP) w Dz.U. 2018 poz. 1286.</w:t>
+      </w:r>
+    </w:p>
+    <w:p>
+      <w:pPr>
+        <w:spacing w:after="80"/>
+      </w:pPr>
+      <w:r>
+        <w:rPr>
+          <w:rFonts w:ascii="Arial" w:cs="Arial" w:eastAsia="Arial" w:hAnsi="Arial"/>
+          <w:sz w:val="20"/>
+          <w:szCs w:val="20"/>
+        </w:rPr>
+        <w:t xml:space="preserve">CAS 104-55-2: Brak określonych krajowych wartości najwyższych dopuszczalnych stężeń (NDS, NDSCh, NDSP) w Dz.U. 2018 poz. 1286.</w:t>
+      </w:r>
+    </w:p>
+    <w:p>
+      <w:pPr>
+        <w:spacing w:after="80"/>
+      </w:pPr>
+      <w:r>
+        <w:rPr>
+          <w:rFonts w:ascii="Arial" w:cs="Arial" w:eastAsia="Arial" w:hAnsi="Arial"/>
+          <w:sz w:val="20"/>
+          <w:szCs w:val="20"/>
+        </w:rPr>
+        <w:t xml:space="preserve">CAS 55965-84-9: Brak określonych krajowych wartości najwyższych dopuszczalnych stężeń (NDS, NDSCh, NDSP) w Dz.U. 2018 poz. 1286.</w:t>
       </w:r>
     </w:p>
     <w:p>

</xml_diff>

<commit_message>
feat(sds): de-hallucinate sections 1-7 and align strictly with manufacturer declarations (ADR-047)
</commit_message>
<xml_diff>
--- a/docs/SDS/Karta_Charakterystyki_8051944811087_SDS_NAJMA.docx
+++ b/docs/SDS/Karta_Charakterystyki_8051944811087_SDS_NAJMA.docx
@@ -55,7 +55,6 @@
         <w:pBdr>
           <w:bottom w:color="00A651" w:sz="12" w:space="1"/>
         </w:pBdr>
-        <w:shd w:fill="FFF9E6" w:val="clear"/>
         <w:spacing w:after="150" w:before="300"/>
       </w:pPr>
       <w:r>
@@ -65,7 +64,7 @@
           <w:sz w:val="22"/>
           <w:szCs w:val="22"/>
         </w:rPr>
-        <w:t xml:space="preserve">SEKCJA 1</w:t>
+        <w:t xml:space="preserve">SEKCJA 1: IDENTYFIKACJA SUBSTANCJI/MIESZANINY I IDENTYFIKACJA PRZEDSIĘBIORSTWA</w:t>
       </w:r>
     </w:p>
     <w:p>
@@ -80,20 +79,76 @@
           <w:sz w:val="20"/>
           <w:szCs w:val="20"/>
         </w:rPr>
-        <w:t xml:space="preserve">1.1. Identyfikator produktu: SWEET HOME LAYALI - PROFUMA TESSUTI E AMBIENTE NAJMA</w:t>
-      </w:r>
-    </w:p>
-    <w:p>
-      <w:pPr>
-        <w:spacing w:after="80"/>
-      </w:pPr>
-      <w:r>
-        <w:rPr>
-          <w:rFonts w:ascii="Arial" w:cs="Arial" w:eastAsia="Arial" w:hAnsi="Arial"/>
-          <w:sz w:val="20"/>
-          <w:szCs w:val="20"/>
-        </w:rPr>
-        <w:t xml:space="preserve">UFI: AJAD-RP52-PA98-ME4H</w:t>
+        <w:t xml:space="preserve">1.1. Identyfikator produktu</w:t>
+      </w:r>
+    </w:p>
+    <w:p>
+      <w:pPr>
+        <w:spacing w:after="80" w:before="80"/>
+      </w:pPr>
+      <w:r>
+        <w:rPr>
+          <w:rFonts w:ascii="Arial" w:cs="Arial" w:eastAsia="Arial" w:hAnsi="Arial"/>
+          <w:b/>
+          <w:bCs/>
+          <w:sz w:val="20"/>
+          <w:szCs w:val="20"/>
+        </w:rPr>
+        <w:t xml:space="preserve">Nazwa handlowa:</w:t>
+      </w:r>
+      <w:r>
+        <w:rPr>
+          <w:rFonts w:ascii="Arial" w:cs="Arial" w:eastAsia="Arial" w:hAnsi="Arial"/>
+          <w:sz w:val="20"/>
+          <w:szCs w:val="20"/>
+        </w:rPr>
+        <w:t xml:space="preserve"> SWEET HOME LAYALI - PROFUMA TESSUTI E AMBIENTE NAJMA</w:t>
+      </w:r>
+    </w:p>
+    <w:p>
+      <w:pPr>
+        <w:spacing w:after="80" w:before="80"/>
+      </w:pPr>
+      <w:r>
+        <w:rPr>
+          <w:rFonts w:ascii="Arial" w:cs="Arial" w:eastAsia="Arial" w:hAnsi="Arial"/>
+          <w:b/>
+          <w:bCs/>
+          <w:sz w:val="20"/>
+          <w:szCs w:val="20"/>
+        </w:rPr>
+        <w:t xml:space="preserve">Kod produktu:</w:t>
+      </w:r>
+      <w:r>
+        <w:rPr>
+          <w:rFonts w:ascii="Arial" w:cs="Arial" w:eastAsia="Arial" w:hAnsi="Arial"/>
+          <w:sz w:val="20"/>
+          <w:szCs w:val="20"/>
+        </w:rPr>
+        <w:t xml:space="preserve"> BLK2084</w:t>
+      </w:r>
+    </w:p>
+    <w:p>
+      <w:pPr>
+        <w:spacing w:after="80" w:before="80"/>
+      </w:pPr>
+      <w:r>
+        <w:rPr>
+          <w:rFonts w:ascii="Arial" w:cs="Arial" w:eastAsia="Arial" w:hAnsi="Arial"/>
+          <w:b/>
+          <w:bCs/>
+          <w:sz w:val="20"/>
+          <w:szCs w:val="20"/>
+        </w:rPr>
+        <w:t xml:space="preserve">UFI:</w:t>
+      </w:r>
+      <w:r>
+        <w:rPr>
+          <w:rFonts w:ascii="Arial" w:cs="Arial" w:eastAsia="Arial" w:hAnsi="Arial"/>
+          <w:sz w:val="20"/>
+          <w:szCs w:val="20"/>
+        </w:rPr>
+        <w:t xml:space="preserve"> AJAD-RP52-PA98-ME4H</w:t>
       </w:r>
     </w:p>
     <w:p>
@@ -108,7 +163,204 @@
           <w:sz w:val="20"/>
           <w:szCs w:val="20"/>
         </w:rPr>
-        <w:t xml:space="preserve">1.4. Numer telefonu alarmowego:</w:t>
+        <w:t xml:space="preserve">1.2. Istotne zidentyfikowane zastosowania substancji lub mieszaniny oraz zastosowania odradzane</w:t>
+      </w:r>
+    </w:p>
+    <w:p>
+      <w:pPr>
+        <w:spacing w:after="80" w:before="80"/>
+      </w:pPr>
+      <w:r>
+        <w:rPr>
+          <w:rFonts w:ascii="Arial" w:cs="Arial" w:eastAsia="Arial" w:hAnsi="Arial"/>
+          <w:b/>
+          <w:bCs/>
+          <w:sz w:val="20"/>
+          <w:szCs w:val="20"/>
+        </w:rPr>
+        <w:t xml:space="preserve">Zastosowanie zidentyfikowane:</w:t>
+      </w:r>
+      <w:r>
+        <w:rPr>
+          <w:rFonts w:ascii="Arial" w:cs="Arial" w:eastAsia="Arial" w:hAnsi="Arial"/>
+          <w:sz w:val="20"/>
+          <w:szCs w:val="20"/>
+        </w:rPr>
+        <w:t xml:space="preserve"> Zastosowanie konsumenckie: perfumy do tkanin i prania.</w:t>
+      </w:r>
+    </w:p>
+    <w:p>
+      <w:pPr>
+        <w:spacing w:after="80" w:before="80"/>
+      </w:pPr>
+      <w:r>
+        <w:rPr>
+          <w:rFonts w:ascii="Arial" w:cs="Arial" w:eastAsia="Arial" w:hAnsi="Arial"/>
+          <w:b/>
+          <w:bCs/>
+          <w:sz w:val="20"/>
+          <w:szCs w:val="20"/>
+        </w:rPr>
+        <w:t xml:space="preserve">Zastosowania odradzane:</w:t>
+      </w:r>
+      <w:r>
+        <w:rPr>
+          <w:rFonts w:ascii="Arial" w:cs="Arial" w:eastAsia="Arial" w:hAnsi="Arial"/>
+          <w:sz w:val="20"/>
+          <w:szCs w:val="20"/>
+        </w:rPr>
+        <w:t xml:space="preserve"> Nie stosować do celów innych niż wskazane.</w:t>
+      </w:r>
+    </w:p>
+    <w:p>
+      <w:pPr>
+        <w:spacing w:after="100" w:before="200"/>
+      </w:pPr>
+      <w:r>
+        <w:rPr>
+          <w:rFonts w:ascii="Arial" w:cs="Arial" w:eastAsia="Arial" w:hAnsi="Arial"/>
+          <w:b/>
+          <w:bCs/>
+          <w:sz w:val="20"/>
+          <w:szCs w:val="20"/>
+        </w:rPr>
+        <w:t xml:space="preserve">1.3. Dane dotyczące dostawcy karty charakterystyki</w:t>
+      </w:r>
+    </w:p>
+    <w:p>
+      <w:pPr>
+        <w:spacing w:after="80" w:before="150"/>
+      </w:pPr>
+      <w:r>
+        <w:rPr>
+          <w:rFonts w:ascii="Arial" w:cs="Arial" w:eastAsia="Arial" w:hAnsi="Arial"/>
+          <w:b/>
+          <w:bCs/>
+          <w:sz w:val="20"/>
+          <w:szCs w:val="20"/>
+        </w:rPr>
+        <w:t xml:space="preserve">Producent / Podmiot wprowadzający do obrotu:</w:t>
+      </w:r>
+    </w:p>
+    <w:p>
+      <w:pPr>
+        <w:spacing w:after="80"/>
+      </w:pPr>
+      <w:r>
+        <w:rPr>
+          <w:rFonts w:ascii="Arial" w:cs="Arial" w:eastAsia="Arial" w:hAnsi="Arial"/>
+          <w:sz w:val="20"/>
+          <w:szCs w:val="20"/>
+        </w:rPr>
+        <w:t xml:space="preserve">SUAREZ COMPANY S.R.L.</w:t>
+      </w:r>
+    </w:p>
+    <w:p>
+      <w:pPr>
+        <w:spacing w:after="80"/>
+      </w:pPr>
+      <w:r>
+        <w:rPr>
+          <w:rFonts w:ascii="Arial" w:cs="Arial" w:eastAsia="Arial" w:hAnsi="Arial"/>
+          <w:sz w:val="20"/>
+          <w:szCs w:val="20"/>
+        </w:rPr>
+        <w:t xml:space="preserve">Via Pergolesi, 1, 20811 Cesano Maderno (MI) - Włochy</w:t>
+      </w:r>
+    </w:p>
+    <w:p>
+      <w:pPr>
+        <w:spacing w:after="80"/>
+      </w:pPr>
+      <w:r>
+        <w:rPr>
+          <w:rFonts w:ascii="Arial" w:cs="Arial" w:eastAsia="Arial" w:hAnsi="Arial"/>
+          <w:sz w:val="20"/>
+          <w:szCs w:val="20"/>
+        </w:rPr>
+        <w:t xml:space="preserve">Tel. +39 0362659766 | www.suarezcompany.it</w:t>
+      </w:r>
+    </w:p>
+    <w:p>
+      <w:pPr>
+        <w:spacing w:after="80"/>
+      </w:pPr>
+      <w:r>
+        <w:rPr>
+          <w:rFonts w:ascii="Arial" w:cs="Arial" w:eastAsia="Arial" w:hAnsi="Arial"/>
+          <w:sz w:val="20"/>
+          <w:szCs w:val="20"/>
+        </w:rPr>
+        <w:t xml:space="preserve">E-mail osoby odpowiedzialnej: info@suarezcompany.it</w:t>
+      </w:r>
+    </w:p>
+    <w:p>
+      <w:pPr>
+        <w:spacing w:after="80" w:before="150"/>
+      </w:pPr>
+      <w:r>
+        <w:rPr>
+          <w:rFonts w:ascii="Arial" w:cs="Arial" w:eastAsia="Arial" w:hAnsi="Arial"/>
+          <w:b/>
+          <w:bCs/>
+          <w:sz w:val="20"/>
+          <w:szCs w:val="20"/>
+        </w:rPr>
+        <w:t xml:space="preserve">Dystrybutor w Polsce:</w:t>
+      </w:r>
+    </w:p>
+    <w:p>
+      <w:pPr>
+        <w:spacing w:after="80"/>
+      </w:pPr>
+      <w:r>
+        <w:rPr>
+          <w:rFonts w:ascii="Arial" w:cs="Arial" w:eastAsia="Arial" w:hAnsi="Arial"/>
+          <w:sz w:val="20"/>
+          <w:szCs w:val="20"/>
+        </w:rPr>
+        <w:t xml:space="preserve">MITRANS Weronika Grzesiak</w:t>
+      </w:r>
+    </w:p>
+    <w:p>
+      <w:pPr>
+        <w:spacing w:after="80"/>
+      </w:pPr>
+      <w:r>
+        <w:rPr>
+          <w:rFonts w:ascii="Arial" w:cs="Arial" w:eastAsia="Arial" w:hAnsi="Arial"/>
+          <w:sz w:val="20"/>
+          <w:szCs w:val="20"/>
+        </w:rPr>
+        <w:t xml:space="preserve">ul. Wesoła 16, 63-600 Kępno, woj. wielkopolskie</w:t>
+      </w:r>
+    </w:p>
+    <w:p>
+      <w:pPr>
+        <w:spacing w:after="80"/>
+      </w:pPr>
+      <w:r>
+        <w:rPr>
+          <w:rFonts w:ascii="Arial" w:cs="Arial" w:eastAsia="Arial" w:hAnsi="Arial"/>
+          <w:sz w:val="20"/>
+          <w:szCs w:val="20"/>
+        </w:rPr>
+        <w:t xml:space="preserve">E-mail: kontakt@prostozwloch.com.pl | Tel. +48 663116607</w:t>
+      </w:r>
+    </w:p>
+    <w:p>
+      <w:pPr>
+        <w:spacing w:after="100" w:before="200"/>
+      </w:pPr>
+      <w:r>
+        <w:rPr>
+          <w:rFonts w:ascii="Arial" w:cs="Arial" w:eastAsia="Arial" w:hAnsi="Arial"/>
+          <w:b/>
+          <w:bCs/>
+          <w:sz w:val="20"/>
+          <w:szCs w:val="20"/>
+        </w:rPr>
+        <w:t xml:space="preserve">1.4. Numer telefonu alarmowego</w:t>
       </w:r>
     </w:p>
     <w:p>
@@ -126,69 +378,25 @@
     </w:p>
     <w:p>
       <w:pPr>
-        <w:spacing w:after="100" w:before="200"/>
-      </w:pPr>
-      <w:r>
-        <w:rPr>
-          <w:rFonts w:ascii="Arial" w:cs="Arial" w:eastAsia="Arial" w:hAnsi="Arial"/>
-          <w:b/>
-          <w:bCs/>
-          <w:sz w:val="20"/>
-          <w:szCs w:val="20"/>
-        </w:rPr>
-        <w:t xml:space="preserve">1.3. Dane dotyczące dostawcy karty charakterystyki</w:t>
-      </w:r>
-    </w:p>
-    <w:p>
-      <w:pPr>
-        <w:spacing w:after="80"/>
-      </w:pPr>
-      <w:r>
-        <w:rPr>
-          <w:rFonts w:ascii="Arial" w:cs="Arial" w:eastAsia="Arial" w:hAnsi="Arial"/>
-          <w:sz w:val="20"/>
-          <w:szCs w:val="20"/>
-        </w:rPr>
-        <w:t xml:space="preserve">Firma: MITRANS Weronika Grzesiak</w:t>
-      </w:r>
-    </w:p>
-    <w:p>
-      <w:pPr>
-        <w:spacing w:after="80"/>
-      </w:pPr>
-      <w:r>
-        <w:rPr>
-          <w:rFonts w:ascii="Arial" w:cs="Arial" w:eastAsia="Arial" w:hAnsi="Arial"/>
-          <w:sz w:val="20"/>
-          <w:szCs w:val="20"/>
-        </w:rPr>
-        <w:t xml:space="preserve">Adres: ul. Wesoła 16, 63-600 Kępno, woj. wielkopolskie</w:t>
-      </w:r>
-    </w:p>
-    <w:p>
-      <w:pPr>
-        <w:spacing w:after="80"/>
-      </w:pPr>
-      <w:r>
-        <w:rPr>
-          <w:rFonts w:ascii="Arial" w:cs="Arial" w:eastAsia="Arial" w:hAnsi="Arial"/>
-          <w:sz w:val="20"/>
-          <w:szCs w:val="20"/>
-        </w:rPr>
-        <w:t xml:space="preserve">E-mail: kontakt@prostozwloch.com.pl</w:t>
-      </w:r>
-    </w:p>
-    <w:p>
-      <w:pPr>
-        <w:spacing w:after="80"/>
-      </w:pPr>
-      <w:r>
-        <w:rPr>
-          <w:rFonts w:ascii="Arial" w:cs="Arial" w:eastAsia="Arial" w:hAnsi="Arial"/>
-          <w:sz w:val="20"/>
-          <w:szCs w:val="20"/>
-        </w:rPr>
-        <w:t xml:space="preserve">Telefon: +48 663116607</w:t>
+        <w:spacing w:after="80" w:before="80"/>
+      </w:pPr>
+      <w:r>
+        <w:rPr>
+          <w:rFonts w:ascii="Arial" w:cs="Arial" w:eastAsia="Arial" w:hAnsi="Arial"/>
+          <w:b/>
+          <w:bCs/>
+          <w:sz w:val="20"/>
+          <w:szCs w:val="20"/>
+        </w:rPr>
+        <w:t xml:space="preserve">Telefon producenta:</w:t>
+      </w:r>
+      <w:r>
+        <w:rPr>
+          <w:rFonts w:ascii="Arial" w:cs="Arial" w:eastAsia="Arial" w:hAnsi="Arial"/>
+          <w:sz w:val="20"/>
+          <w:szCs w:val="20"/>
+        </w:rPr>
+        <w:t xml:space="preserve"> +39 0362659766 (w godzinach pracy biura, język włoski/angielski)</w:t>
       </w:r>
     </w:p>
     <w:p>
@@ -1264,7 +1472,7 @@
           <w:sz w:val="20"/>
           <w:szCs w:val="20"/>
         </w:rPr>
-        <w:t xml:space="preserve"> Zdjąć zanieczyszczoną odzież. Narażone partie skóry zmyć dokładnie dużą ilością wody z mydłem. W przypadku wystąpienia podrażnienia skóry lub reakcji alergicznej skonsultować się z lekarzem.</w:t>
+        <w:t xml:space="preserve"> Zmyć natychmiast dużą ilością wody z mydłem.</w:t>
       </w:r>
     </w:p>
     <w:p>
@@ -1287,7 +1495,7 @@
           <w:sz w:val="20"/>
           <w:szCs w:val="20"/>
         </w:rPr>
-        <w:t xml:space="preserve"> Płukać obficie wodą przy szeroko otwartych powiekach przez co najmniej 10-15 minut. Chronić niepodrażnione oko, usunąć soczewki kontaktowe, jeżeli są i można je łatwo usunąć. Natychmiast skonsultować się z lekarzem okulistą.</w:t>
+        <w:t xml:space="preserve"> Płukać wodą przy otwartych powiekach przez wystarczająco długi czas, następnie natychmiast skonsultować się z lekarzem okulistą. Usunąć soczewki kontaktowe, jeżeli są i można je łatwo usunąć.</w:t>
       </w:r>
     </w:p>
     <w:p>
@@ -1310,7 +1518,7 @@
           <w:sz w:val="20"/>
           <w:szCs w:val="20"/>
         </w:rPr>
-        <w:t xml:space="preserve"> Nie wywoływać wymiotów bez konsultacji lekarskiej. Wypłukać usta wodą. Nigdy nie podawać niczego do ust osobie nieprzytomnej. Natychmiast zasięgnąć porady lekarza, pokazując kartę charakterystyki lub etykietę produktu.</w:t>
+        <w:t xml:space="preserve"> Nie wywoływać wymiotów. Niezwłocznie zasięgnąć porady lekarza, pokazując kartę charakterystyki lub etykietę produktu.</w:t>
       </w:r>
     </w:p>
     <w:p>
@@ -1333,7 +1541,7 @@
           <w:sz w:val="20"/>
           <w:szCs w:val="20"/>
         </w:rPr>
-        <w:t xml:space="preserve"> Wyprowadzić poszkodowanego na świeże powietrze, zapewnić ciepło i spokój w pozycji półsiedzącej. W przypadku wystąpienia niepokojących objawów lub złego samopoczucia skonsultować się z lekarzem i pokazać opakowanie lub etykietę.</w:t>
+        <w:t xml:space="preserve"> Wyprowadzić poszkodowanego na świeże powietrze, zapewnić ciepło i spokój. W przypadku wystąpienia objawów skonsultować się z lekarzem i pokazać opakowanie lub etykietę.</w:t>
       </w:r>
     </w:p>
     <w:p>
@@ -1361,7 +1569,7 @@
           <w:sz w:val="20"/>
           <w:szCs w:val="20"/>
         </w:rPr>
-        <w:t xml:space="preserve">Brak dostępnych szczegółowych informacji na temat specyficznych objawów i skutków wywoływanych przez produkt. W kontakcie ze skórą może wywoływać reakcję alergiczną u osób podatnych (zawiera substancje uczulające wymienione w sekcji 2.2).</w:t>
+        <w:t xml:space="preserve">Brak dostępnych szczegółowych informacji na temat objawów i skutków wywoływanych przez produkt.</w:t>
       </w:r>
     </w:p>
     <w:p>
@@ -1399,7 +1607,7 @@
           <w:sz w:val="20"/>
           <w:szCs w:val="20"/>
         </w:rPr>
-        <w:t xml:space="preserve"> Leczenie objawowe. Brak dostępnych szczegółowych danych dotyczących specyficznego leczenia lub antidotum. Decyzję o sposobie postępowania ratunkowego podejmuje lekarz po dokładnej ocenie stanu poszkodowanego.</w:t>
+        <w:t xml:space="preserve"> Brak danych.</w:t>
       </w:r>
     </w:p>
     <w:p>
@@ -1454,7 +1662,7 @@
           <w:sz w:val="20"/>
           <w:szCs w:val="20"/>
         </w:rPr>
-        <w:t xml:space="preserve"> Piana gaśnicza, proszek gaśniczy, gaśnica śniegowa (CO2), rozproszony strumień wody (mgła wodna).</w:t>
+        <w:t xml:space="preserve"> Gaśnica śniegowa (CO2), gaśnica proszkowa, piana gaśnicza, woda.</w:t>
       </w:r>
     </w:p>
     <w:p>
@@ -1477,7 +1685,7 @@
           <w:sz w:val="20"/>
           <w:szCs w:val="20"/>
         </w:rPr>
-        <w:t xml:space="preserve"> Brak szczególnych ograniczeń. Nie zaleca się stosowania zwartego strumienia wody ze względu na ryzyko rozprzestrzenienia pożaru.</w:t>
+        <w:t xml:space="preserve"> Brak szczególnych.</w:t>
       </w:r>
     </w:p>
     <w:p>
@@ -1497,15 +1705,25 @@
     </w:p>
     <w:p>
       <w:pPr>
-        <w:spacing w:after="80"/>
-      </w:pPr>
-      <w:r>
-        <w:rPr>
-          <w:rFonts w:ascii="Arial" w:cs="Arial" w:eastAsia="Arial" w:hAnsi="Arial"/>
-          <w:sz w:val="20"/>
-          <w:szCs w:val="20"/>
-        </w:rPr>
-        <w:t xml:space="preserve">Unikać wdychania produktów spalania. Podczas pożaru mogą wydzielać się toksyczne gazy, dymy i tlenki węgla.</w:t>
+        <w:spacing w:after="80" w:before="80"/>
+      </w:pPr>
+      <w:r>
+        <w:rPr>
+          <w:rFonts w:ascii="Arial" w:cs="Arial" w:eastAsia="Arial" w:hAnsi="Arial"/>
+          <w:b/>
+          <w:bCs/>
+          <w:sz w:val="20"/>
+          <w:szCs w:val="20"/>
+        </w:rPr>
+        <w:t xml:space="preserve">Szczególne zagrożenia:</w:t>
+      </w:r>
+      <w:r>
+        <w:rPr>
+          <w:rFonts w:ascii="Arial" w:cs="Arial" w:eastAsia="Arial" w:hAnsi="Arial"/>
+          <w:sz w:val="20"/>
+          <w:szCs w:val="20"/>
+        </w:rPr>
+        <w:t xml:space="preserve"> Unikać wdychania produktów spalania.</w:t>
       </w:r>
     </w:p>
     <w:p>
@@ -1543,7 +1761,7 @@
           <w:sz w:val="20"/>
           <w:szCs w:val="20"/>
         </w:rPr>
-        <w:t xml:space="preserve"> Gromadzić oddzielnie zanieczyszczoną wodę gaśniczą; nie dopuścić do jej przedostania się do kanalizacji i wód gruntowych. Stosować odzież ochronną dla strażaków zgodną z normą europejską EN 469. Stosować autonomiczny aparat oddechowy (SCBA) z rękawicami chemoodpornymi.</w:t>
+        <w:t xml:space="preserve"> Gromadzić oddzielnie zanieczyszczoną wodę gaśniczą; nie dopuścić do jej przedostania się do kanalizacji. Stosować odzież ochronną dla strażaków zgodną z normą europejską EN 469 oraz autonomiczny aparat oddechowy (SCBA) z rękawicami odpornymi na chemikalia.</w:t>
       </w:r>
     </w:p>
     <w:p>
@@ -1598,7 +1816,7 @@
           <w:sz w:val="20"/>
           <w:szCs w:val="20"/>
         </w:rPr>
-        <w:t xml:space="preserve"> Ewakuować osoby niepowołane z obszaru zagrożenia. Unikać zanieczyszczenia skóry i oczu. Zapewnić odpowiednią wentylację pomieszczeń.</w:t>
+        <w:t xml:space="preserve"> Stosować środki ochrony indywidualnej. Ewakuować osoby w bezpieczne miejsce. Patrz środki ochronne w punkcie 7 i 8.</w:t>
       </w:r>
     </w:p>
     <w:p>
@@ -1621,7 +1839,7 @@
           <w:sz w:val="20"/>
           <w:szCs w:val="20"/>
         </w:rPr>
-        <w:t xml:space="preserve"> Stosować kompletne wyposażenie ochronne (patrz sekcja 8). Unikać wdychania oparów/aerozoli.</w:t>
+        <w:t xml:space="preserve"> Stosować środki ochrony indywidualnej.</w:t>
       </w:r>
     </w:p>
     <w:p>
@@ -1649,7 +1867,7 @@
           <w:sz w:val="20"/>
           <w:szCs w:val="20"/>
         </w:rPr>
-        <w:t xml:space="preserve">Nie dopuścić do przedostania się produktu do gleby, wód gruntowych, wód powierzchniowych ani do kanalizacji. Zatrzymać zanieczyszczoną wodę z mycia i przekazać do bezpiecznej utylizacji. W przypadku skażenia wód lub przedostania się do kanalizacji niezwłocznie powiadomić właściwe władze i służby ratownicze.</w:t>
+        <w:t xml:space="preserve">Nie dopuścić do przedostania się do gleby/podglebia. Nie dopuścić do przedostania się do wód powierzchniowych ani kanalizacji. Zatrzymać zanieczyszczoną wodę z mycia i przekazać do utylizacji. W przypadku wycieku gazu lub przedostania się do cieków wodnych, gleby lub kanalizacji powiadomić właściwe władze.</w:t>
       </w:r>
     </w:p>
     <w:p>
@@ -1669,15 +1887,25 @@
     </w:p>
     <w:p>
       <w:pPr>
-        <w:spacing w:after="80"/>
-      </w:pPr>
-      <w:r>
-        <w:rPr>
-          <w:rFonts w:ascii="Arial" w:cs="Arial" w:eastAsia="Arial" w:hAnsi="Arial"/>
-          <w:sz w:val="20"/>
-          <w:szCs w:val="20"/>
-        </w:rPr>
-        <w:t xml:space="preserve">Zatamować wyciek, o ile jest to bezpieczne. Ograniczyć rozprzestrzenianie i zebrać za pomocą niepalnego materiału absorbującego ciecze (piasek, ziemia okrzemkowa, uniwersalny środek wiążący, trociny) do oznakowanych pojemników na odpady. Zanieczyszczoną powierzchnię zmyć dużą ilością wody.</w:t>
+        <w:spacing w:after="80" w:before="80"/>
+      </w:pPr>
+      <w:r>
+        <w:rPr>
+          <w:rFonts w:ascii="Arial" w:cs="Arial" w:eastAsia="Arial" w:hAnsi="Arial"/>
+          <w:b/>
+          <w:bCs/>
+          <w:sz w:val="20"/>
+          <w:szCs w:val="20"/>
+        </w:rPr>
+        <w:t xml:space="preserve">Odpowiedni materiał do zbierania:</w:t>
+      </w:r>
+      <w:r>
+        <w:rPr>
+          <w:rFonts w:ascii="Arial" w:cs="Arial" w:eastAsia="Arial" w:hAnsi="Arial"/>
+          <w:sz w:val="20"/>
+          <w:szCs w:val="20"/>
+        </w:rPr>
+        <w:t xml:space="preserve"> materiał pochłaniający, organiczny, piasek. Zmyć dużą ilością wody.</w:t>
       </w:r>
     </w:p>
     <w:p>
@@ -1705,7 +1933,7 @@
           <w:sz w:val="20"/>
           <w:szCs w:val="20"/>
         </w:rPr>
-        <w:t xml:space="preserve">Informacje dotyczące odpowiedniego sprzętu ochrony indywidualnej podano w sekcji 8. Informacje dotyczące bezpiecznego postępowania z substancją podano w sekcji 7. Informacje dotyczące unieszkodliwiania odpadów podano w sekcji 13.</w:t>
+        <w:t xml:space="preserve">Patrz również sekcja 8 i 13.</w:t>
       </w:r>
     </w:p>
     <w:p>
@@ -1760,7 +1988,7 @@
           <w:sz w:val="20"/>
           <w:szCs w:val="20"/>
         </w:rPr>
-        <w:t xml:space="preserve"> Unikać kontaktu ze skórą i oczami. Unikać wdychania par, mgieł oraz rozpylonej cieczy. Zapewnić odpowiednią wentylację w miejscu pracy. Nie wdychać rozpylanego aerozolu.</w:t>
+        <w:t xml:space="preserve"> Unikać kontaktu ze skórą i oczami oraz wdychania par i mgieł. Patrz również sekcja 8 w celu zapoznania się z zalecanym sprzętem ochrony osobistej.</w:t>
       </w:r>
     </w:p>
     <w:p>
@@ -1783,7 +2011,22 @@
           <w:sz w:val="20"/>
           <w:szCs w:val="20"/>
         </w:rPr>
-        <w:t xml:space="preserve"> Nie jeść, nie pić i nie palić tytoniu podczas stosowania produktu. Dokładnie umyć ręce wodą z mydłem po użyciu oraz przed posiłkami. Zdjąć zanieczyszczoną odzież i sprzęt ochronny przed wejściem do miejsc przeznaczonych do spożywania posiłków. Wyprać zanieczyszczoną odzież przed ponownym użyciem.</w:t>
+        <w:t xml:space="preserve"> Nie jeść i nie pić podczas pracy.</w:t>
+      </w:r>
+    </w:p>
+    <w:p>
+      <w:pPr>
+        <w:spacing w:after="100" w:before="200"/>
+      </w:pPr>
+      <w:r>
+        <w:rPr>
+          <w:rFonts w:ascii="Arial" w:cs="Arial" w:eastAsia="Arial" w:hAnsi="Arial"/>
+          <w:b/>
+          <w:bCs/>
+          <w:sz w:val="20"/>
+          <w:szCs w:val="20"/>
+        </w:rPr>
+        <w:t xml:space="preserve">7.2. Warunki bezpiecznego magazynowania, w tym informacje dotyczące wszelkich wzajemnych niezgodności</w:t>
       </w:r>
     </w:p>
     <w:p>
@@ -1798,15 +2041,38 @@
           <w:sz w:val="20"/>
           <w:szCs w:val="20"/>
         </w:rPr>
-        <w:t xml:space="preserve">Zalecany sprzęt ochrony osobistej:</w:t>
-      </w:r>
-      <w:r>
-        <w:rPr>
-          <w:rFonts w:ascii="Arial" w:cs="Arial" w:eastAsia="Arial" w:hAnsi="Arial"/>
-          <w:sz w:val="20"/>
-          <w:szCs w:val="20"/>
-        </w:rPr>
-        <w:t xml:space="preserve"> patrz sekcja 8.</w:t>
+        <w:t xml:space="preserve">Materiały niezgodne:</w:t>
+      </w:r>
+      <w:r>
+        <w:rPr>
+          <w:rFonts w:ascii="Arial" w:cs="Arial" w:eastAsia="Arial" w:hAnsi="Arial"/>
+          <w:sz w:val="20"/>
+          <w:szCs w:val="20"/>
+        </w:rPr>
+        <w:t xml:space="preserve"> Brak szczególnych.</w:t>
+      </w:r>
+    </w:p>
+    <w:p>
+      <w:pPr>
+        <w:spacing w:after="80" w:before="80"/>
+      </w:pPr>
+      <w:r>
+        <w:rPr>
+          <w:rFonts w:ascii="Arial" w:cs="Arial" w:eastAsia="Arial" w:hAnsi="Arial"/>
+          <w:b/>
+          <w:bCs/>
+          <w:sz w:val="20"/>
+          <w:szCs w:val="20"/>
+        </w:rPr>
+        <w:t xml:space="preserve">Wskazówki dotyczące pomieszczeń magazynowych:</w:t>
+      </w:r>
+      <w:r>
+        <w:rPr>
+          <w:rFonts w:ascii="Arial" w:cs="Arial" w:eastAsia="Arial" w:hAnsi="Arial"/>
+          <w:sz w:val="20"/>
+          <w:szCs w:val="20"/>
+        </w:rPr>
+        <w:t xml:space="preserve"> Pomieszczenia odpowiednio wentylowane.</w:t>
       </w:r>
     </w:p>
     <w:p>
@@ -1821,7 +2087,20 @@
           <w:sz w:val="20"/>
           <w:szCs w:val="20"/>
         </w:rPr>
-        <w:t xml:space="preserve">7.2. Warunki bezpiecznego magazynowania, w tym informacje dotyczące wszelkich wzajemnych niezgodności</w:t>
+        <w:t xml:space="preserve">7.3. Szczególne zastosowanie(-a) końcowe</w:t>
+      </w:r>
+    </w:p>
+    <w:p>
+      <w:pPr>
+        <w:spacing w:after="80"/>
+      </w:pPr>
+      <w:r>
+        <w:rPr>
+          <w:rFonts w:ascii="Arial" w:cs="Arial" w:eastAsia="Arial" w:hAnsi="Arial"/>
+          <w:sz w:val="20"/>
+          <w:szCs w:val="20"/>
+        </w:rPr>
+        <w:t xml:space="preserve">Brak szczególnych.</w:t>
       </w:r>
     </w:p>
     <w:p>
@@ -1836,136 +2115,6 @@
           <w:sz w:val="20"/>
           <w:szCs w:val="20"/>
         </w:rPr>
-        <w:t xml:space="preserve">Warunki magazynowania:</w:t>
-      </w:r>
-      <w:r>
-        <w:rPr>
-          <w:rFonts w:ascii="Arial" w:cs="Arial" w:eastAsia="Arial" w:hAnsi="Arial"/>
-          <w:sz w:val="20"/>
-          <w:szCs w:val="20"/>
-        </w:rPr>
-        <w:t xml:space="preserve"> Przechowywać w oryginalnych, prawidłowo oznakowanych i szczelnie zamkniętych opakowaniach, w suchym, chłodnym i dobrze wentylowanym miejscu. Chronić przed bezpośrednim nasłonecznieniem, wilgocią, przemrożeniem i źródłami ciepła.</w:t>
-      </w:r>
-    </w:p>
-    <w:p>
-      <w:pPr>
-        <w:spacing w:after="80" w:before="80"/>
-      </w:pPr>
-      <w:r>
-        <w:rPr>
-          <w:rFonts w:ascii="Arial" w:cs="Arial" w:eastAsia="Arial" w:hAnsi="Arial"/>
-          <w:b/>
-          <w:bCs/>
-          <w:sz w:val="20"/>
-          <w:szCs w:val="20"/>
-        </w:rPr>
-        <w:t xml:space="preserve">Zalecana temperatura magazynowania:</w:t>
-      </w:r>
-      <w:r>
-        <w:rPr>
-          <w:rFonts w:ascii="Arial" w:cs="Arial" w:eastAsia="Arial" w:hAnsi="Arial"/>
-          <w:sz w:val="20"/>
-          <w:szCs w:val="20"/>
-        </w:rPr>
-        <w:t xml:space="preserve"> od 5°C do 30°C. Przechowywać w miejscu niedostępnym dla dzieci i osób nieupoważnionych.</w:t>
-      </w:r>
-    </w:p>
-    <w:p>
-      <w:pPr>
-        <w:spacing w:after="80" w:before="80"/>
-      </w:pPr>
-      <w:r>
-        <w:rPr>
-          <w:rFonts w:ascii="Arial" w:cs="Arial" w:eastAsia="Arial" w:hAnsi="Arial"/>
-          <w:b/>
-          <w:bCs/>
-          <w:sz w:val="20"/>
-          <w:szCs w:val="20"/>
-        </w:rPr>
-        <w:t xml:space="preserve">Materiały niezgodne:</w:t>
-      </w:r>
-      <w:r>
-        <w:rPr>
-          <w:rFonts w:ascii="Arial" w:cs="Arial" w:eastAsia="Arial" w:hAnsi="Arial"/>
-          <w:sz w:val="20"/>
-          <w:szCs w:val="20"/>
-        </w:rPr>
-        <w:t xml:space="preserve"> Brak szczególnych przy prawidłowym użytkowaniu i magazynowaniu. Nie przechowywać razem z silnymi utleniaczami, mocnymi kwasami, zasadami oraz żywnością, napojami i paszami dla zwierząt.</w:t>
-      </w:r>
-    </w:p>
-    <w:p>
-      <w:pPr>
-        <w:spacing w:after="80" w:before="80"/>
-      </w:pPr>
-      <w:r>
-        <w:rPr>
-          <w:rFonts w:ascii="Arial" w:cs="Arial" w:eastAsia="Arial" w:hAnsi="Arial"/>
-          <w:b/>
-          <w:bCs/>
-          <w:sz w:val="20"/>
-          <w:szCs w:val="20"/>
-        </w:rPr>
-        <w:t xml:space="preserve">Wskazówki dotyczące pomieszczeń magazynowych:</w:t>
-      </w:r>
-      <w:r>
-        <w:rPr>
-          <w:rFonts w:ascii="Arial" w:cs="Arial" w:eastAsia="Arial" w:hAnsi="Arial"/>
-          <w:sz w:val="20"/>
-          <w:szCs w:val="20"/>
-        </w:rPr>
-        <w:t xml:space="preserve"> Pomieszczenia magazynowe powinny być odpowiednio wentylowane, suche, o nienasiąkliwej i odpornej chemicznie posadzce uniemożliwiającej przenikanie cieczy do gruntu i kanalizacji.</w:t>
-      </w:r>
-    </w:p>
-    <w:p>
-      <w:pPr>
-        <w:spacing w:after="100" w:before="200"/>
-      </w:pPr>
-      <w:r>
-        <w:rPr>
-          <w:rFonts w:ascii="Arial" w:cs="Arial" w:eastAsia="Arial" w:hAnsi="Arial"/>
-          <w:b/>
-          <w:bCs/>
-          <w:sz w:val="20"/>
-          <w:szCs w:val="20"/>
-        </w:rPr>
-        <w:t xml:space="preserve">7.3. Szczególne zastosowanie(-a) końcowe</w:t>
-      </w:r>
-    </w:p>
-    <w:p>
-      <w:pPr>
-        <w:spacing w:after="80" w:before="80"/>
-      </w:pPr>
-      <w:r>
-        <w:rPr>
-          <w:rFonts w:ascii="Arial" w:cs="Arial" w:eastAsia="Arial" w:hAnsi="Arial"/>
-          <w:b/>
-          <w:bCs/>
-          <w:sz w:val="20"/>
-          <w:szCs w:val="20"/>
-        </w:rPr>
-        <w:t xml:space="preserve">Zastosowanie:</w:t>
-      </w:r>
-      <w:r>
-        <w:rPr>
-          <w:rFonts w:ascii="Arial" w:cs="Arial" w:eastAsia="Arial" w:hAnsi="Arial"/>
-          <w:sz w:val="20"/>
-          <w:szCs w:val="20"/>
-        </w:rPr>
-        <w:t xml:space="preserve"> Mieszanina zapachowa / perfumy do tkanin i wnętrz (odświeżacz powietrza). Brak innych szczególnych zastosowań poza wymienionymi w podsekcji 1.2. Stosować ściśle według zaleceń producenta i instrukcji na etykiecie.</w:t>
-      </w:r>
-    </w:p>
-    <w:p>
-      <w:pPr>
-        <w:spacing w:after="80" w:before="80"/>
-      </w:pPr>
-      <w:r>
-        <w:rPr>
-          <w:rFonts w:ascii="Arial" w:cs="Arial" w:eastAsia="Arial" w:hAnsi="Arial"/>
-          <w:b/>
-          <w:bCs/>
-          <w:sz w:val="20"/>
-          <w:szCs w:val="20"/>
-        </w:rPr>
         <w:t xml:space="preserve">Rozwiązania specyficzne dla sektora przemysłowego:</w:t>
       </w:r>
       <w:r>
@@ -1974,7 +2123,7 @@
           <w:sz w:val="20"/>
           <w:szCs w:val="20"/>
         </w:rPr>
-        <w:t xml:space="preserve"> Brak szczególnych wytycznych.</w:t>
+        <w:t xml:space="preserve"> Brak szczególnych.</w:t>
       </w:r>
     </w:p>
     <w:p>

</xml_diff>

<commit_message>
feat(sds): overhaul section 8 exposure controls, remove quarantine and duplicates (ADR-048)
</commit_message>
<xml_diff>
--- a/docs/SDS/Karta_Charakterystyki_8051944811087_SDS_NAJMA.docx
+++ b/docs/SDS/Karta_Charakterystyki_8051944811087_SDS_NAJMA.docx
@@ -2160,67 +2160,119 @@
     </w:p>
     <w:p>
       <w:pPr>
-        <w:spacing w:after="80"/>
-      </w:pPr>
-      <w:r>
-        <w:rPr>
-          <w:rFonts w:ascii="Arial" w:cs="Arial" w:eastAsia="Arial" w:hAnsi="Arial"/>
-          <w:sz w:val="20"/>
-          <w:szCs w:val="20"/>
-        </w:rPr>
-        <w:t xml:space="preserve">[FLAGA_QUARANTINE_REVIEW] Algorytm zablokował zagraniczne limity OEL/MAK/TLV.</w:t>
-      </w:r>
-    </w:p>
-    <w:p>
-      <w:pPr>
-        <w:spacing w:after="80"/>
-      </w:pPr>
-      <w:r>
-        <w:rPr>
-          <w:rFonts w:ascii="Arial" w:cs="Arial" w:eastAsia="Arial" w:hAnsi="Arial"/>
-          <w:sz w:val="20"/>
-          <w:szCs w:val="20"/>
-        </w:rPr>
-        <w:t xml:space="preserve">KRYTYCZNE: Safety Assessor ma obowiązek uzupełnić poniższe wartości o polskie limity NDS, NDSCh, NDSP zgodnie z Dz.U. 2018 poz. 1286.</w:t>
-      </w:r>
-    </w:p>
-    <w:p>
-      <w:pPr>
-        <w:spacing w:after="80"/>
-      </w:pPr>
-      <w:r>
-        <w:rPr>
-          <w:rFonts w:ascii="Arial" w:cs="Arial" w:eastAsia="Arial" w:hAnsi="Arial"/>
-          <w:sz w:val="20"/>
-          <w:szCs w:val="20"/>
-        </w:rPr>
-        <w:t xml:space="preserve">CAS 32210-23-4: Brak określonych krajowych wartości najwyższych dopuszczalnych stężeń (NDS, NDSCh, NDSP) w Dz.U. 2018 poz. 1286.</w:t>
-      </w:r>
-    </w:p>
-    <w:p>
-      <w:pPr>
-        <w:spacing w:after="80"/>
-      </w:pPr>
-      <w:r>
-        <w:rPr>
-          <w:rFonts w:ascii="Arial" w:cs="Arial" w:eastAsia="Arial" w:hAnsi="Arial"/>
-          <w:sz w:val="20"/>
-          <w:szCs w:val="20"/>
-        </w:rPr>
-        <w:t xml:space="preserve">CAS 104-55-2: Brak określonych krajowych wartości najwyższych dopuszczalnych stężeń (NDS, NDSCh, NDSP) w Dz.U. 2018 poz. 1286.</w:t>
-      </w:r>
-    </w:p>
-    <w:p>
-      <w:pPr>
-        <w:spacing w:after="80"/>
-      </w:pPr>
-      <w:r>
-        <w:rPr>
-          <w:rFonts w:ascii="Arial" w:cs="Arial" w:eastAsia="Arial" w:hAnsi="Arial"/>
-          <w:sz w:val="20"/>
-          <w:szCs w:val="20"/>
-        </w:rPr>
-        <w:t xml:space="preserve">CAS 55965-84-9: Brak określonych krajowych wartości najwyższych dopuszczalnych stężeń (NDS, NDSCh, NDSP) w Dz.U. 2018 poz. 1286.</w:t>
+        <w:spacing w:after="80" w:before="150"/>
+      </w:pPr>
+      <w:r>
+        <w:rPr>
+          <w:rFonts w:ascii="Arial" w:cs="Arial" w:eastAsia="Arial" w:hAnsi="Arial"/>
+          <w:b/>
+          <w:bCs/>
+          <w:sz w:val="20"/>
+          <w:szCs w:val="20"/>
+        </w:rPr>
+        <w:t xml:space="preserve">Krajowe wartości najwyższych dopuszczalnych stężeń w środowisku pracy (Polska):</w:t>
+      </w:r>
+    </w:p>
+    <w:p>
+      <w:pPr>
+        <w:spacing w:after="80"/>
+      </w:pPr>
+      <w:r>
+        <w:rPr>
+          <w:rFonts w:ascii="Arial" w:cs="Arial" w:eastAsia="Arial" w:hAnsi="Arial"/>
+          <w:sz w:val="20"/>
+          <w:szCs w:val="20"/>
+        </w:rPr>
+        <w:t xml:space="preserve">Dla składników mieszaniny wymienionych w sekcji 3 nie określono wartości najwyższych dopuszczalnych stężeń (NDS, NDSCh, NDSP) w środowisku pracy zgodnie z Rozporządzeniem Ministra Rodziny, Pracy i Polityki Społecznej z dnia 12 czerwca 2018 r. w sprawie najwyższych dopuszczalnych stężeń i natężeń czynników szkodliwych dla zdrowia w środowisku pracy (Dz.U. 2018 poz. 1286 z późn. zm.).</w:t>
+      </w:r>
+    </w:p>
+    <w:p>
+      <w:pPr>
+        <w:spacing w:after="80" w:before="150"/>
+      </w:pPr>
+      <w:r>
+        <w:rPr>
+          <w:rFonts w:ascii="Arial" w:cs="Arial" w:eastAsia="Arial" w:hAnsi="Arial"/>
+          <w:b/>
+          <w:bCs/>
+          <w:sz w:val="20"/>
+          <w:szCs w:val="20"/>
+        </w:rPr>
+        <w:t xml:space="preserve">Wspólnotowe i zagraniczne dopuszczalne wartości narażenia zawodowego (OEL):</w:t>
+      </w:r>
+    </w:p>
+    <w:p>
+      <w:pPr>
+        <w:spacing w:after="80" w:before="150"/>
+      </w:pPr>
+      <w:r>
+        <w:rPr>
+          <w:rFonts w:ascii="Arial" w:cs="Arial" w:eastAsia="Arial" w:hAnsi="Arial"/>
+          <w:b/>
+          <w:bCs/>
+          <w:sz w:val="20"/>
+          <w:szCs w:val="20"/>
+        </w:rPr>
+        <w:t xml:space="preserve">Masa poreakcyjna 5-chloro-2-metylo-2H-izotiazol-3-onu i 2-metylo-2H-izotiazol-3-onu (3:1) (CAS: 55965-84-9):</w:t>
+      </w:r>
+    </w:p>
+    <w:p>
+      <w:pPr>
+        <w:spacing w:after="80"/>
+      </w:pPr>
+      <w:r>
+        <w:rPr>
+          <w:rFonts w:ascii="Arial" w:cs="Arial" w:eastAsia="Arial" w:hAnsi="Arial"/>
+          <w:sz w:val="20"/>
+          <w:szCs w:val="20"/>
+        </w:rPr>
+        <w:t xml:space="preserve">Austria – wartość dopuszczalna długoterminowa (8h): 0,05 mg/m³; Uwagi: MAK, Sh; Źródło: GKV, BGBl. II Nr. 156/2021.</w:t>
+      </w:r>
+    </w:p>
+    <w:p>
+      <w:pPr>
+        <w:spacing w:after="80" w:before="80"/>
+      </w:pPr>
+      <w:r>
+        <w:rPr>
+          <w:rFonts w:ascii="Arial" w:cs="Arial" w:eastAsia="Arial" w:hAnsi="Arial"/>
+          <w:b/>
+          <w:bCs/>
+          <w:sz w:val="20"/>
+          <w:szCs w:val="20"/>
+        </w:rPr>
+        <w:t xml:space="preserve">Wartości DNEL i PNEC:</w:t>
+      </w:r>
+      <w:r>
+        <w:rPr>
+          <w:rFonts w:ascii="Arial" w:cs="Arial" w:eastAsia="Arial" w:hAnsi="Arial"/>
+          <w:sz w:val="20"/>
+          <w:szCs w:val="20"/>
+        </w:rPr>
+        <w:t xml:space="preserve"> Dla mieszaniny i jej składników nie oznaczono wartości DNEL oraz PNEC.</w:t>
+      </w:r>
+    </w:p>
+    <w:p>
+      <w:pPr>
+        <w:spacing w:after="80" w:before="80"/>
+      </w:pPr>
+      <w:r>
+        <w:rPr>
+          <w:rFonts w:ascii="Arial" w:cs="Arial" w:eastAsia="Arial" w:hAnsi="Arial"/>
+          <w:b/>
+          <w:bCs/>
+          <w:sz w:val="20"/>
+          <w:szCs w:val="20"/>
+        </w:rPr>
+        <w:t xml:space="preserve">Zalecane procedury monitorowania:</w:t>
+      </w:r>
+      <w:r>
+        <w:rPr>
+          <w:rFonts w:ascii="Arial" w:cs="Arial" w:eastAsia="Arial" w:hAnsi="Arial"/>
+          <w:sz w:val="20"/>
+          <w:szCs w:val="20"/>
+        </w:rPr>
+        <w:t xml:space="preserve"> Należy stosować procedury monitorowania stężeń niebezpiecznych substancji w powietrzu na stanowiskach pracy oraz procedury kontroli wentylacji zgodnie z odpowiednimi Polskimi Normami.</w:t>
       </w:r>
     </w:p>
     <w:p>
@@ -2235,20 +2287,168 @@
           <w:sz w:val="20"/>
           <w:szCs w:val="20"/>
         </w:rPr>
-        <w:t xml:space="preserve">8.2. Kontrola narażenia:</w:t>
-      </w:r>
-    </w:p>
-    <w:p>
-      <w:pPr>
-        <w:spacing w:after="80"/>
-      </w:pPr>
-      <w:r>
-        <w:rPr>
-          <w:rFonts w:ascii="Arial" w:cs="Arial" w:eastAsia="Arial" w:hAnsi="Arial"/>
-          <w:sz w:val="20"/>
-          <w:szCs w:val="20"/>
-        </w:rPr>
-        <w:t xml:space="preserve">Ochrona rąk: Rękawice ochronne zgodne z normą EN 374. Ochrona oczu: Okulary ochronne (EN 166).</w:t>
+        <w:t xml:space="preserve">8.2. Kontrola narażenia</w:t>
+      </w:r>
+    </w:p>
+    <w:p>
+      <w:pPr>
+        <w:spacing w:after="80" w:before="80"/>
+      </w:pPr>
+      <w:r>
+        <w:rPr>
+          <w:rFonts w:ascii="Arial" w:cs="Arial" w:eastAsia="Arial" w:hAnsi="Arial"/>
+          <w:b/>
+          <w:bCs/>
+          <w:sz w:val="20"/>
+          <w:szCs w:val="20"/>
+        </w:rPr>
+        <w:t xml:space="preserve">Ochrona oczu:</w:t>
+      </w:r>
+      <w:r>
+        <w:rPr>
+          <w:rFonts w:ascii="Arial" w:cs="Arial" w:eastAsia="Arial" w:hAnsi="Arial"/>
+          <w:sz w:val="20"/>
+          <w:szCs w:val="20"/>
+        </w:rPr>
+        <w:t xml:space="preserve"> Brak szczególnych wymagań w normalnych warunkach stosowania. Należy jednak postępować zgodnie z dobrymi praktykami roboczymi.</w:t>
+      </w:r>
+    </w:p>
+    <w:p>
+      <w:pPr>
+        <w:spacing w:after="80" w:before="80"/>
+      </w:pPr>
+      <w:r>
+        <w:rPr>
+          <w:rFonts w:ascii="Arial" w:cs="Arial" w:eastAsia="Arial" w:hAnsi="Arial"/>
+          <w:b/>
+          <w:bCs/>
+          <w:sz w:val="20"/>
+          <w:szCs w:val="20"/>
+        </w:rPr>
+        <w:t xml:space="preserve">Ochrona skóry:</w:t>
+      </w:r>
+      <w:r>
+        <w:rPr>
+          <w:rFonts w:ascii="Arial" w:cs="Arial" w:eastAsia="Arial" w:hAnsi="Arial"/>
+          <w:sz w:val="20"/>
+          <w:szCs w:val="20"/>
+        </w:rPr>
+        <w:t xml:space="preserve"> Nie są wymagane szczególne środki ostrożności przy normalnym stosowaniu.</w:t>
+      </w:r>
+    </w:p>
+    <w:p>
+      <w:pPr>
+        <w:spacing w:after="80" w:before="80"/>
+      </w:pPr>
+      <w:r>
+        <w:rPr>
+          <w:rFonts w:ascii="Arial" w:cs="Arial" w:eastAsia="Arial" w:hAnsi="Arial"/>
+          <w:b/>
+          <w:bCs/>
+          <w:sz w:val="20"/>
+          <w:szCs w:val="20"/>
+        </w:rPr>
+        <w:t xml:space="preserve">Ochrona rąk:</w:t>
+      </w:r>
+      <w:r>
+        <w:rPr>
+          <w:rFonts w:ascii="Arial" w:cs="Arial" w:eastAsia="Arial" w:hAnsi="Arial"/>
+          <w:sz w:val="20"/>
+          <w:szCs w:val="20"/>
+        </w:rPr>
+        <w:t xml:space="preserve"> Nie jest wymagana przy normalnym stosowaniu.</w:t>
+      </w:r>
+    </w:p>
+    <w:p>
+      <w:pPr>
+        <w:spacing w:after="80" w:before="80"/>
+      </w:pPr>
+      <w:r>
+        <w:rPr>
+          <w:rFonts w:ascii="Arial" w:cs="Arial" w:eastAsia="Arial" w:hAnsi="Arial"/>
+          <w:b/>
+          <w:bCs/>
+          <w:sz w:val="20"/>
+          <w:szCs w:val="20"/>
+        </w:rPr>
+        <w:t xml:space="preserve">Ochrona dróg oddechowych:</w:t>
+      </w:r>
+      <w:r>
+        <w:rPr>
+          <w:rFonts w:ascii="Arial" w:cs="Arial" w:eastAsia="Arial" w:hAnsi="Arial"/>
+          <w:sz w:val="20"/>
+          <w:szCs w:val="20"/>
+        </w:rPr>
+        <w:t xml:space="preserve"> Nie dotyczy.</w:t>
+      </w:r>
+    </w:p>
+    <w:p>
+      <w:pPr>
+        <w:spacing w:after="80" w:before="80"/>
+      </w:pPr>
+      <w:r>
+        <w:rPr>
+          <w:rFonts w:ascii="Arial" w:cs="Arial" w:eastAsia="Arial" w:hAnsi="Arial"/>
+          <w:b/>
+          <w:bCs/>
+          <w:sz w:val="20"/>
+          <w:szCs w:val="20"/>
+        </w:rPr>
+        <w:t xml:space="preserve">Zagrożenia termiczne:</w:t>
+      </w:r>
+      <w:r>
+        <w:rPr>
+          <w:rFonts w:ascii="Arial" w:cs="Arial" w:eastAsia="Arial" w:hAnsi="Arial"/>
+          <w:sz w:val="20"/>
+          <w:szCs w:val="20"/>
+        </w:rPr>
+        <w:t xml:space="preserve"> Nie dotyczy.</w:t>
+      </w:r>
+    </w:p>
+    <w:p>
+      <w:pPr>
+        <w:spacing w:after="80" w:before="80"/>
+      </w:pPr>
+      <w:r>
+        <w:rPr>
+          <w:rFonts w:ascii="Arial" w:cs="Arial" w:eastAsia="Arial" w:hAnsi="Arial"/>
+          <w:b/>
+          <w:bCs/>
+          <w:sz w:val="20"/>
+          <w:szCs w:val="20"/>
+        </w:rPr>
+        <w:t xml:space="preserve">Kontrola narażenia środowiska:</w:t>
+      </w:r>
+      <w:r>
+        <w:rPr>
+          <w:rFonts w:ascii="Arial" w:cs="Arial" w:eastAsia="Arial" w:hAnsi="Arial"/>
+          <w:sz w:val="20"/>
+          <w:szCs w:val="20"/>
+        </w:rPr>
+        <w:t xml:space="preserve"> Nie dotyczy.</w:t>
+      </w:r>
+    </w:p>
+    <w:p>
+      <w:pPr>
+        <w:spacing w:after="80" w:before="80"/>
+      </w:pPr>
+      <w:r>
+        <w:rPr>
+          <w:rFonts w:ascii="Arial" w:cs="Arial" w:eastAsia="Arial" w:hAnsi="Arial"/>
+          <w:b/>
+          <w:bCs/>
+          <w:sz w:val="20"/>
+          <w:szCs w:val="20"/>
+        </w:rPr>
+        <w:t xml:space="preserve">Środki higieniczne i techniczne:</w:t>
+      </w:r>
+      <w:r>
+        <w:rPr>
+          <w:rFonts w:ascii="Arial" w:cs="Arial" w:eastAsia="Arial" w:hAnsi="Arial"/>
+          <w:sz w:val="20"/>
+          <w:szCs w:val="20"/>
+        </w:rPr>
+        <w:t xml:space="preserve"> Nie dotyczy.</w:t>
       </w:r>
     </w:p>
     <w:p>

</xml_diff>